<commit_message>
Am adaugat o parte din proiectarea bazei de date si am  completat sectiunea de operatii in word
</commit_message>
<xml_diff>
--- a/docs/Ilyes_Kasian_Proiect_BD.docx
+++ b/docs/Ilyes_Kasian_Proiect_BD.docx
@@ -225,21 +225,11 @@
             <w:pPr>
               <w:jc w:val="right"/>
             </w:pPr>
-            <w:r>
-              <w:rPr>
-                <w:b/>
-                <w:bCs/>
-              </w:rPr>
-              <w:t>Cadru didactic coordonator:</w:t>
-            </w:r>
           </w:p>
           <w:p>
             <w:pPr>
               <w:jc w:val="right"/>
             </w:pPr>
-            <w:r>
-              <w:t>Bogdan Văduva</w:t>
-            </w:r>
           </w:p>
         </w:tc>
       </w:tr>
@@ -324,7 +314,7 @@
           <w:r>
             <w:fldChar w:fldCharType="separate"/>
           </w:r>
-          <w:hyperlink w:anchor="_Toc242997826" w:history="1">
+          <w:hyperlink w:anchor="_Toc243476259" w:history="1">
             <w:r>
               <w:rPr>
                 <w:rStyle w:val="Hyperlink"/>
@@ -352,7 +342,7 @@
                 <w:noProof/>
                 <w:webHidden/>
               </w:rPr>
-              <w:instrText xml:space="preserve"> PAGEREF _Toc242997826 \h </w:instrText>
+              <w:instrText xml:space="preserve"> PAGEREF _Toc243476259 \h </w:instrText>
             </w:r>
             <w:r>
               <w:rPr>
@@ -393,7 +383,7 @@
               <w14:ligatures w14:val="standardContextual"/>
             </w:rPr>
           </w:pPr>
-          <w:hyperlink w:anchor="_Toc242997827" w:history="1">
+          <w:hyperlink w:anchor="_Toc243476260" w:history="1">
             <w:r>
               <w:rPr>
                 <w:rStyle w:val="Hyperlink"/>
@@ -420,7 +410,7 @@
                 <w:noProof/>
                 <w:webHidden/>
               </w:rPr>
-              <w:instrText xml:space="preserve"> PAGEREF _Toc242997827 \h </w:instrText>
+              <w:instrText xml:space="preserve"> PAGEREF _Toc243476260 \h </w:instrText>
             </w:r>
             <w:r>
               <w:rPr>
@@ -461,7 +451,7 @@
               <w14:ligatures w14:val="standardContextual"/>
             </w:rPr>
           </w:pPr>
-          <w:hyperlink w:anchor="_Toc242997828" w:history="1">
+          <w:hyperlink w:anchor="_Toc243476261" w:history="1">
             <w:r>
               <w:rPr>
                 <w:rStyle w:val="Hyperlink"/>
@@ -489,7 +479,7 @@
                 <w:noProof/>
                 <w:webHidden/>
               </w:rPr>
-              <w:instrText xml:space="preserve"> PAGEREF _Toc242997828 \h </w:instrText>
+              <w:instrText xml:space="preserve"> PAGEREF _Toc243476261 \h </w:instrText>
             </w:r>
             <w:r>
               <w:rPr>
@@ -530,7 +520,7 @@
               <w14:ligatures w14:val="standardContextual"/>
             </w:rPr>
           </w:pPr>
-          <w:hyperlink w:anchor="_Toc242997829" w:history="1">
+          <w:hyperlink w:anchor="_Toc243476262" w:history="1">
             <w:r>
               <w:rPr>
                 <w:rStyle w:val="Hyperlink"/>
@@ -558,7 +548,7 @@
                 <w:noProof/>
                 <w:webHidden/>
               </w:rPr>
-              <w:instrText xml:space="preserve"> PAGEREF _Toc242997829 \h </w:instrText>
+              <w:instrText xml:space="preserve"> PAGEREF _Toc243476262 \h </w:instrText>
             </w:r>
             <w:r>
               <w:rPr>
@@ -601,7 +591,7 @@
               <w14:ligatures w14:val="standardContextual"/>
             </w:rPr>
           </w:pPr>
-          <w:hyperlink w:anchor="_Toc242997830" w:history="1">
+          <w:hyperlink w:anchor="_Toc243476263" w:history="1">
             <w:r>
               <w:rPr>
                 <w:rStyle w:val="Hyperlink"/>
@@ -628,7 +618,7 @@
                 <w:noProof/>
                 <w:webHidden/>
               </w:rPr>
-              <w:instrText xml:space="preserve"> PAGEREF _Toc242997830 \h </w:instrText>
+              <w:instrText xml:space="preserve"> PAGEREF _Toc243476263 \h </w:instrText>
             </w:r>
             <w:r>
               <w:rPr>
@@ -648,7 +638,7 @@
                 <w:noProof/>
                 <w:webHidden/>
               </w:rPr>
-              <w:t>1</w:t>
+              <w:t>2</w:t>
             </w:r>
             <w:r>
               <w:rPr>
@@ -669,7 +659,7 @@
               <w14:ligatures w14:val="standardContextual"/>
             </w:rPr>
           </w:pPr>
-          <w:hyperlink w:anchor="_Toc242997831" w:history="1">
+          <w:hyperlink w:anchor="_Toc243476264" w:history="1">
             <w:r>
               <w:rPr>
                 <w:rStyle w:val="Hyperlink"/>
@@ -696,7 +686,7 @@
                 <w:noProof/>
                 <w:webHidden/>
               </w:rPr>
-              <w:instrText xml:space="preserve"> PAGEREF _Toc242997831 \h </w:instrText>
+              <w:instrText xml:space="preserve"> PAGEREF _Toc243476264 \h </w:instrText>
             </w:r>
             <w:r>
               <w:rPr>
@@ -716,7 +706,7 @@
                 <w:noProof/>
                 <w:webHidden/>
               </w:rPr>
-              <w:t>1</w:t>
+              <w:t>2</w:t>
             </w:r>
             <w:r>
               <w:rPr>
@@ -737,7 +727,7 @@
               <w14:ligatures w14:val="standardContextual"/>
             </w:rPr>
           </w:pPr>
-          <w:hyperlink w:anchor="_Toc242997832" w:history="1">
+          <w:hyperlink w:anchor="_Toc243476265" w:history="1">
             <w:r>
               <w:rPr>
                 <w:rStyle w:val="Hyperlink"/>
@@ -764,7 +754,7 @@
                 <w:noProof/>
                 <w:webHidden/>
               </w:rPr>
-              <w:instrText xml:space="preserve"> PAGEREF _Toc242997832 \h </w:instrText>
+              <w:instrText xml:space="preserve"> PAGEREF _Toc243476265 \h </w:instrText>
             </w:r>
             <w:r>
               <w:rPr>
@@ -805,7 +795,7 @@
               <w14:ligatures w14:val="standardContextual"/>
             </w:rPr>
           </w:pPr>
-          <w:hyperlink w:anchor="_Toc242997833" w:history="1">
+          <w:hyperlink w:anchor="_Toc243476266" w:history="1">
             <w:r>
               <w:rPr>
                 <w:rStyle w:val="Hyperlink"/>
@@ -832,7 +822,7 @@
                 <w:noProof/>
                 <w:webHidden/>
               </w:rPr>
-              <w:instrText xml:space="preserve"> PAGEREF _Toc242997833 \h </w:instrText>
+              <w:instrText xml:space="preserve"> PAGEREF _Toc243476266 \h </w:instrText>
             </w:r>
             <w:r>
               <w:rPr>
@@ -853,6 +843,416 @@
                 <w:webHidden/>
               </w:rPr>
               <w:t>2</w:t>
+            </w:r>
+            <w:r>
+              <w:rPr>
+                <w:noProof/>
+                <w:webHidden/>
+              </w:rPr>
+              <w:fldChar w:fldCharType="end"/>
+            </w:r>
+          </w:hyperlink>
+        </w:p>
+        <w:p>
+          <w:pPr>
+            <w:pStyle w:val="TOC1"/>
+            <w:rPr>
+              <w:rFonts w:asciiTheme="minorHAnsi" w:eastAsiaTheme="minorEastAsia" w:hAnsiTheme="minorHAnsi" w:cstheme="minorBidi"/>
+              <w:b w:val="0"/>
+              <w:bCs w:val="0"/>
+              <w:noProof/>
+              <w:kern w:val="2"/>
+              <w14:ligatures w14:val="standardContextual"/>
+            </w:rPr>
+          </w:pPr>
+          <w:hyperlink w:anchor="_Toc243476267" w:history="1">
+            <w:r>
+              <w:rPr>
+                <w:rStyle w:val="Hyperlink"/>
+                <w:noProof/>
+              </w:rPr>
+              <w:t>3. Proiectare</w:t>
+            </w:r>
+            <w:r>
+              <w:rPr>
+                <w:noProof/>
+                <w:webHidden/>
+              </w:rPr>
+              <w:tab/>
+            </w:r>
+            <w:r>
+              <w:rPr>
+                <w:noProof/>
+                <w:webHidden/>
+              </w:rPr>
+              <w:fldChar w:fldCharType="begin"/>
+            </w:r>
+            <w:r>
+              <w:rPr>
+                <w:noProof/>
+                <w:webHidden/>
+              </w:rPr>
+              <w:instrText xml:space="preserve"> PAGEREF _Toc243476267 \h </w:instrText>
+            </w:r>
+            <w:r>
+              <w:rPr>
+                <w:noProof/>
+                <w:webHidden/>
+              </w:rPr>
+            </w:r>
+            <w:r>
+              <w:rPr>
+                <w:noProof/>
+                <w:webHidden/>
+              </w:rPr>
+              <w:fldChar w:fldCharType="separate"/>
+            </w:r>
+            <w:r>
+              <w:rPr>
+                <w:noProof/>
+                <w:webHidden/>
+              </w:rPr>
+              <w:t>3</w:t>
+            </w:r>
+            <w:r>
+              <w:rPr>
+                <w:noProof/>
+                <w:webHidden/>
+              </w:rPr>
+              <w:fldChar w:fldCharType="end"/>
+            </w:r>
+          </w:hyperlink>
+        </w:p>
+        <w:p>
+          <w:pPr>
+            <w:pStyle w:val="TOC2"/>
+            <w:rPr>
+              <w:rFonts w:asciiTheme="minorHAnsi" w:eastAsiaTheme="minorEastAsia" w:hAnsiTheme="minorHAnsi" w:cstheme="minorBidi"/>
+              <w:noProof/>
+              <w:kern w:val="2"/>
+              <w14:ligatures w14:val="standardContextual"/>
+            </w:rPr>
+          </w:pPr>
+          <w:hyperlink w:anchor="_Toc243476268" w:history="1">
+            <w:r>
+              <w:rPr>
+                <w:rStyle w:val="Hyperlink"/>
+                <w:noProof/>
+              </w:rPr>
+              <w:t>3.1 Analiza cerintelor</w:t>
+            </w:r>
+            <w:r>
+              <w:rPr>
+                <w:noProof/>
+                <w:webHidden/>
+              </w:rPr>
+              <w:tab/>
+            </w:r>
+            <w:r>
+              <w:rPr>
+                <w:noProof/>
+                <w:webHidden/>
+              </w:rPr>
+              <w:fldChar w:fldCharType="begin"/>
+            </w:r>
+            <w:r>
+              <w:rPr>
+                <w:noProof/>
+                <w:webHidden/>
+              </w:rPr>
+              <w:instrText xml:space="preserve"> PAGEREF _Toc243476268 \h </w:instrText>
+            </w:r>
+            <w:r>
+              <w:rPr>
+                <w:noProof/>
+                <w:webHidden/>
+              </w:rPr>
+            </w:r>
+            <w:r>
+              <w:rPr>
+                <w:noProof/>
+                <w:webHidden/>
+              </w:rPr>
+              <w:fldChar w:fldCharType="separate"/>
+            </w:r>
+            <w:r>
+              <w:rPr>
+                <w:noProof/>
+                <w:webHidden/>
+              </w:rPr>
+              <w:t>3</w:t>
+            </w:r>
+            <w:r>
+              <w:rPr>
+                <w:noProof/>
+                <w:webHidden/>
+              </w:rPr>
+              <w:fldChar w:fldCharType="end"/>
+            </w:r>
+          </w:hyperlink>
+        </w:p>
+        <w:p>
+          <w:pPr>
+            <w:pStyle w:val="TOC3"/>
+            <w:tabs>
+              <w:tab w:val="right" w:leader="dot" w:pos="9062"/>
+            </w:tabs>
+            <w:rPr>
+              <w:noProof/>
+            </w:rPr>
+          </w:pPr>
+          <w:hyperlink w:anchor="_Toc243476269" w:history="1">
+            <w:r>
+              <w:rPr>
+                <w:rStyle w:val="Hyperlink"/>
+                <w:noProof/>
+              </w:rPr>
+              <w:t>3.1.1 Actorii sistemului</w:t>
+            </w:r>
+            <w:r>
+              <w:rPr>
+                <w:noProof/>
+                <w:webHidden/>
+              </w:rPr>
+              <w:tab/>
+            </w:r>
+            <w:r>
+              <w:rPr>
+                <w:noProof/>
+                <w:webHidden/>
+              </w:rPr>
+              <w:fldChar w:fldCharType="begin"/>
+            </w:r>
+            <w:r>
+              <w:rPr>
+                <w:noProof/>
+                <w:webHidden/>
+              </w:rPr>
+              <w:instrText xml:space="preserve"> PAGEREF _Toc243476269 \h </w:instrText>
+            </w:r>
+            <w:r>
+              <w:rPr>
+                <w:noProof/>
+                <w:webHidden/>
+              </w:rPr>
+            </w:r>
+            <w:r>
+              <w:rPr>
+                <w:noProof/>
+                <w:webHidden/>
+              </w:rPr>
+              <w:fldChar w:fldCharType="separate"/>
+            </w:r>
+            <w:r>
+              <w:rPr>
+                <w:noProof/>
+                <w:webHidden/>
+              </w:rPr>
+              <w:t>3</w:t>
+            </w:r>
+            <w:r>
+              <w:rPr>
+                <w:noProof/>
+                <w:webHidden/>
+              </w:rPr>
+              <w:fldChar w:fldCharType="end"/>
+            </w:r>
+          </w:hyperlink>
+        </w:p>
+        <w:p>
+          <w:pPr>
+            <w:pStyle w:val="TOC3"/>
+            <w:tabs>
+              <w:tab w:val="right" w:leader="dot" w:pos="9062"/>
+            </w:tabs>
+            <w:rPr>
+              <w:noProof/>
+            </w:rPr>
+          </w:pPr>
+          <w:hyperlink w:anchor="_Toc243476270" w:history="1">
+            <w:r>
+              <w:rPr>
+                <w:rStyle w:val="Hyperlink"/>
+                <w:noProof/>
+              </w:rPr>
+              <w:t>3.1.2 Cerinte functionale</w:t>
+            </w:r>
+            <w:r>
+              <w:rPr>
+                <w:noProof/>
+                <w:webHidden/>
+              </w:rPr>
+              <w:tab/>
+            </w:r>
+            <w:r>
+              <w:rPr>
+                <w:noProof/>
+                <w:webHidden/>
+              </w:rPr>
+              <w:fldChar w:fldCharType="begin"/>
+            </w:r>
+            <w:r>
+              <w:rPr>
+                <w:noProof/>
+                <w:webHidden/>
+              </w:rPr>
+              <w:instrText xml:space="preserve"> PAGEREF _Toc243476270 \h </w:instrText>
+            </w:r>
+            <w:r>
+              <w:rPr>
+                <w:noProof/>
+                <w:webHidden/>
+              </w:rPr>
+            </w:r>
+            <w:r>
+              <w:rPr>
+                <w:noProof/>
+                <w:webHidden/>
+              </w:rPr>
+              <w:fldChar w:fldCharType="separate"/>
+            </w:r>
+            <w:r>
+              <w:rPr>
+                <w:noProof/>
+                <w:webHidden/>
+              </w:rPr>
+              <w:t>3</w:t>
+            </w:r>
+            <w:r>
+              <w:rPr>
+                <w:noProof/>
+                <w:webHidden/>
+              </w:rPr>
+              <w:fldChar w:fldCharType="end"/>
+            </w:r>
+          </w:hyperlink>
+        </w:p>
+        <w:p>
+          <w:pPr>
+            <w:pStyle w:val="TOC3"/>
+            <w:tabs>
+              <w:tab w:val="right" w:leader="dot" w:pos="9062"/>
+            </w:tabs>
+            <w:rPr>
+              <w:noProof/>
+            </w:rPr>
+          </w:pPr>
+          <w:hyperlink w:anchor="_Toc243476271" w:history="1">
+            <w:r>
+              <w:rPr>
+                <w:rStyle w:val="Hyperlink"/>
+                <w:noProof/>
+              </w:rPr>
+              <w:t>3.1.3 Cerinte non-functionale</w:t>
+            </w:r>
+            <w:r>
+              <w:rPr>
+                <w:noProof/>
+                <w:webHidden/>
+              </w:rPr>
+              <w:tab/>
+            </w:r>
+            <w:r>
+              <w:rPr>
+                <w:noProof/>
+                <w:webHidden/>
+              </w:rPr>
+              <w:fldChar w:fldCharType="begin"/>
+            </w:r>
+            <w:r>
+              <w:rPr>
+                <w:noProof/>
+                <w:webHidden/>
+              </w:rPr>
+              <w:instrText xml:space="preserve"> PAGEREF _Toc243476271 \h </w:instrText>
+            </w:r>
+            <w:r>
+              <w:rPr>
+                <w:noProof/>
+                <w:webHidden/>
+              </w:rPr>
+            </w:r>
+            <w:r>
+              <w:rPr>
+                <w:noProof/>
+                <w:webHidden/>
+              </w:rPr>
+              <w:fldChar w:fldCharType="separate"/>
+            </w:r>
+            <w:r>
+              <w:rPr>
+                <w:noProof/>
+                <w:webHidden/>
+              </w:rPr>
+              <w:t>3</w:t>
+            </w:r>
+            <w:r>
+              <w:rPr>
+                <w:noProof/>
+                <w:webHidden/>
+              </w:rPr>
+              <w:fldChar w:fldCharType="end"/>
+            </w:r>
+          </w:hyperlink>
+        </w:p>
+        <w:p>
+          <w:pPr>
+            <w:pStyle w:val="TOC2"/>
+            <w:rPr>
+              <w:rFonts w:asciiTheme="minorHAnsi" w:eastAsiaTheme="minorEastAsia" w:hAnsiTheme="minorHAnsi" w:cstheme="minorBidi"/>
+              <w:noProof/>
+              <w:kern w:val="2"/>
+              <w14:ligatures w14:val="standardContextual"/>
+            </w:rPr>
+          </w:pPr>
+          <w:hyperlink w:anchor="_Toc243476272" w:history="1">
+            <w:r>
+              <w:rPr>
+                <w:rStyle w:val="Hyperlink"/>
+                <w:noProof/>
+              </w:rPr>
+              <w:t>3.2 Model ER</w:t>
+            </w:r>
+            <w:r>
+              <w:rPr>
+                <w:noProof/>
+                <w:webHidden/>
+              </w:rPr>
+              <w:tab/>
+            </w:r>
+            <w:r>
+              <w:rPr>
+                <w:noProof/>
+                <w:webHidden/>
+              </w:rPr>
+              <w:fldChar w:fldCharType="begin"/>
+            </w:r>
+            <w:r>
+              <w:rPr>
+                <w:noProof/>
+                <w:webHidden/>
+              </w:rPr>
+              <w:instrText xml:space="preserve"> PAGEREF _Toc243476272 \h </w:instrText>
+            </w:r>
+            <w:r>
+              <w:rPr>
+                <w:noProof/>
+                <w:webHidden/>
+              </w:rPr>
+            </w:r>
+            <w:r>
+              <w:rPr>
+                <w:noProof/>
+                <w:webHidden/>
+              </w:rPr>
+              <w:fldChar w:fldCharType="separate"/>
+            </w:r>
+            <w:r>
+              <w:rPr>
+                <w:noProof/>
+                <w:webHidden/>
+              </w:rPr>
+              <w:t>3</w:t>
             </w:r>
             <w:r>
               <w:rPr>
@@ -894,7 +1294,7 @@
           <w:lang w:val="ro-RO"/>
         </w:rPr>
       </w:pPr>
-      <w:bookmarkStart w:id="0" w:name="_Toc242997826"/>
+      <w:bookmarkStart w:id="0" w:name="_Toc243476259"/>
       <w:r>
         <w:rPr>
           <w:lang w:val="ro-RO"/>
@@ -923,11 +1323,24 @@
       <w:pPr>
         <w:pStyle w:val="Heading2"/>
       </w:pPr>
-      <w:bookmarkStart w:id="1" w:name="_Toc242997827"/>
-      <w:r>
-        <w:t>1.1. Domeniul abordat</w:t>
+      <w:bookmarkStart w:id="1" w:name="_Toc243476260"/>
+      <w:r>
+        <w:t xml:space="preserve">1.1. </w:t>
+      </w:r>
+      <w:proofErr w:type="spellStart"/>
+      <w:r>
+        <w:t>Domeniul</w:t>
+      </w:r>
+      <w:proofErr w:type="spellEnd"/>
+      <w:r>
+        <w:t xml:space="preserve"> </w:t>
+      </w:r>
+      <w:proofErr w:type="spellStart"/>
+      <w:r>
+        <w:t>abordat</w:t>
       </w:r>
       <w:bookmarkEnd w:id="1"/>
+      <w:proofErr w:type="spellEnd"/>
     </w:p>
     <w:p>
       <w:pPr>
@@ -963,7 +1376,7 @@
           <w:lang w:val="ro-RO"/>
         </w:rPr>
       </w:pPr>
-      <w:bookmarkStart w:id="2" w:name="_Toc242997828"/>
+      <w:bookmarkStart w:id="2" w:name="_Toc243476261"/>
       <w:r>
         <w:rPr>
           <w:lang w:val="ro-RO"/>
@@ -1009,7 +1422,7 @@
           <w:lang w:val="ro-RO"/>
         </w:rPr>
       </w:pPr>
-      <w:bookmarkStart w:id="3" w:name="_Toc242997829"/>
+      <w:bookmarkStart w:id="3" w:name="_Toc243476262"/>
       <w:r>
         <w:rPr>
           <w:lang w:val="ro-RO"/>
@@ -1037,6 +1450,11 @@
       </w:r>
     </w:p>
     <w:p>
+      <w:r>
+        <w:br w:type="page"/>
+      </w:r>
+    </w:p>
+    <w:p>
       <w:pPr>
         <w:jc w:val="both"/>
       </w:pPr>
@@ -1045,11 +1463,16 @@
       <w:pPr>
         <w:pStyle w:val="Heading1"/>
       </w:pPr>
-      <w:bookmarkStart w:id="4" w:name="_Toc242997830"/>
-      <w:r>
-        <w:t>2. Obiective</w:t>
+      <w:bookmarkStart w:id="4" w:name="_Toc243476263"/>
+      <w:r>
+        <w:t xml:space="preserve">2. </w:t>
+      </w:r>
+      <w:proofErr w:type="spellStart"/>
+      <w:r>
+        <w:t>Obiective</w:t>
       </w:r>
       <w:bookmarkEnd w:id="4"/>
+      <w:proofErr w:type="spellEnd"/>
     </w:p>
     <w:p>
       <w:r>
@@ -1061,11 +1484,24 @@
       <w:pPr>
         <w:pStyle w:val="Heading2"/>
       </w:pPr>
-      <w:bookmarkStart w:id="5" w:name="_Toc242997831"/>
-      <w:r>
-        <w:t>2.1 Functionalitati principale</w:t>
+      <w:bookmarkStart w:id="5" w:name="_Toc243476264"/>
+      <w:r>
+        <w:t xml:space="preserve">2.1 </w:t>
+      </w:r>
+      <w:proofErr w:type="spellStart"/>
+      <w:r>
+        <w:t>Functionalitati</w:t>
+      </w:r>
+      <w:proofErr w:type="spellEnd"/>
+      <w:r>
+        <w:t xml:space="preserve"> </w:t>
+      </w:r>
+      <w:proofErr w:type="spellStart"/>
+      <w:r>
+        <w:t>principale</w:t>
       </w:r>
       <w:bookmarkEnd w:id="5"/>
+      <w:proofErr w:type="spellEnd"/>
       <w:r>
         <w:t xml:space="preserve"> </w:t>
       </w:r>
@@ -1084,9 +1520,37 @@
           <w:numId w:val="3"/>
         </w:numPr>
       </w:pPr>
-      <w:r>
-        <w:lastRenderedPageBreak/>
-        <w:t>Evidenta clientilor impreuna cu datele lor de contact;</w:t>
+      <w:proofErr w:type="spellStart"/>
+      <w:r>
+        <w:t>Evidenta</w:t>
+      </w:r>
+      <w:proofErr w:type="spellEnd"/>
+      <w:r>
+        <w:t xml:space="preserve"> </w:t>
+      </w:r>
+      <w:proofErr w:type="spellStart"/>
+      <w:r>
+        <w:t>clientilor</w:t>
+      </w:r>
+      <w:proofErr w:type="spellEnd"/>
+      <w:r>
+        <w:t xml:space="preserve"> </w:t>
+      </w:r>
+      <w:proofErr w:type="spellStart"/>
+      <w:r>
+        <w:t>impreuna</w:t>
+      </w:r>
+      <w:proofErr w:type="spellEnd"/>
+      <w:r>
+        <w:t xml:space="preserve"> cu </w:t>
+      </w:r>
+      <w:proofErr w:type="spellStart"/>
+      <w:r>
+        <w:t>datele</w:t>
+      </w:r>
+      <w:proofErr w:type="spellEnd"/>
+      <w:r>
+        <w:t xml:space="preserve"> lor de contact;</w:t>
       </w:r>
     </w:p>
     <w:p>
@@ -1097,8 +1561,77 @@
           <w:numId w:val="3"/>
         </w:numPr>
       </w:pPr>
-      <w:r>
-        <w:t>Evidenta dosarelor, cu clientul, avocatii responsabili, obiectul cauzel si stadiul current;</w:t>
+      <w:proofErr w:type="spellStart"/>
+      <w:r>
+        <w:t>Evidenta</w:t>
+      </w:r>
+      <w:proofErr w:type="spellEnd"/>
+      <w:r>
+        <w:t xml:space="preserve"> </w:t>
+      </w:r>
+      <w:proofErr w:type="spellStart"/>
+      <w:r>
+        <w:t>dosarelor</w:t>
+      </w:r>
+      <w:proofErr w:type="spellEnd"/>
+      <w:r>
+        <w:t xml:space="preserve">, cu </w:t>
+      </w:r>
+      <w:proofErr w:type="spellStart"/>
+      <w:r>
+        <w:t>clientul</w:t>
+      </w:r>
+      <w:proofErr w:type="spellEnd"/>
+      <w:r>
+        <w:t xml:space="preserve">, </w:t>
+      </w:r>
+      <w:proofErr w:type="spellStart"/>
+      <w:r>
+        <w:t>avocatii</w:t>
+      </w:r>
+      <w:proofErr w:type="spellEnd"/>
+      <w:r>
+        <w:t xml:space="preserve"> </w:t>
+      </w:r>
+      <w:proofErr w:type="spellStart"/>
+      <w:r>
+        <w:t>responsabili</w:t>
+      </w:r>
+      <w:proofErr w:type="spellEnd"/>
+      <w:r>
+        <w:t xml:space="preserve">, </w:t>
+      </w:r>
+      <w:proofErr w:type="spellStart"/>
+      <w:r>
+        <w:t>obiectul</w:t>
+      </w:r>
+      <w:proofErr w:type="spellEnd"/>
+      <w:r>
+        <w:t xml:space="preserve"> </w:t>
+      </w:r>
+      <w:proofErr w:type="spellStart"/>
+      <w:r>
+        <w:t>cauzel</w:t>
+      </w:r>
+      <w:proofErr w:type="spellEnd"/>
+      <w:r>
+        <w:t xml:space="preserve"> </w:t>
+      </w:r>
+      <w:proofErr w:type="spellStart"/>
+      <w:r>
+        <w:t>si</w:t>
+      </w:r>
+      <w:proofErr w:type="spellEnd"/>
+      <w:r>
+        <w:t xml:space="preserve"> </w:t>
+      </w:r>
+      <w:proofErr w:type="spellStart"/>
+      <w:r>
+        <w:t>stadiul</w:t>
+      </w:r>
+      <w:proofErr w:type="spellEnd"/>
+      <w:r>
+        <w:t xml:space="preserve"> current;</w:t>
       </w:r>
     </w:p>
     <w:p>
@@ -1109,8 +1642,69 @@
           <w:numId w:val="3"/>
         </w:numPr>
       </w:pPr>
-      <w:r>
-        <w:t>Gestiunea termenlor procedural si a intalnirilor, inclusive determinarea termenelor care se aproprie;</w:t>
+      <w:proofErr w:type="spellStart"/>
+      <w:r>
+        <w:t>Gestiunea</w:t>
+      </w:r>
+      <w:proofErr w:type="spellEnd"/>
+      <w:r>
+        <w:t xml:space="preserve"> </w:t>
+      </w:r>
+      <w:proofErr w:type="spellStart"/>
+      <w:r>
+        <w:t>termenlor</w:t>
+      </w:r>
+      <w:proofErr w:type="spellEnd"/>
+      <w:r>
+        <w:t xml:space="preserve"> procedural </w:t>
+      </w:r>
+      <w:proofErr w:type="spellStart"/>
+      <w:r>
+        <w:t>si</w:t>
+      </w:r>
+      <w:proofErr w:type="spellEnd"/>
+      <w:r>
+        <w:t xml:space="preserve"> </w:t>
+      </w:r>
+      <w:proofErr w:type="gramStart"/>
+      <w:r>
+        <w:t>a</w:t>
+      </w:r>
+      <w:proofErr w:type="gramEnd"/>
+      <w:r>
+        <w:t xml:space="preserve"> </w:t>
+      </w:r>
+      <w:proofErr w:type="spellStart"/>
+      <w:r>
+        <w:t>intalnirilor</w:t>
+      </w:r>
+      <w:proofErr w:type="spellEnd"/>
+      <w:r>
+        <w:t xml:space="preserve">, inclusive </w:t>
+      </w:r>
+      <w:proofErr w:type="spellStart"/>
+      <w:r>
+        <w:t>determinarea</w:t>
+      </w:r>
+      <w:proofErr w:type="spellEnd"/>
+      <w:r>
+        <w:t xml:space="preserve"> </w:t>
+      </w:r>
+      <w:proofErr w:type="spellStart"/>
+      <w:r>
+        <w:t>termenelor</w:t>
+      </w:r>
+      <w:proofErr w:type="spellEnd"/>
+      <w:r>
+        <w:t xml:space="preserve"> care se </w:t>
+      </w:r>
+      <w:proofErr w:type="spellStart"/>
+      <w:r>
+        <w:t>aproprie</w:t>
+      </w:r>
+      <w:proofErr w:type="spellEnd"/>
+      <w:r>
+        <w:t>;</w:t>
       </w:r>
     </w:p>
     <w:p>
@@ -1121,29 +1715,308 @@
           <w:numId w:val="3"/>
         </w:numPr>
       </w:pPr>
-      <w:r>
-        <w:t>Evidenta documentelor asociate fiecarui dosar;</w:t>
+      <w:proofErr w:type="spellStart"/>
+      <w:r>
+        <w:t>Evidenta</w:t>
+      </w:r>
+      <w:proofErr w:type="spellEnd"/>
+      <w:r>
+        <w:t xml:space="preserve"> </w:t>
+      </w:r>
+      <w:proofErr w:type="spellStart"/>
+      <w:r>
+        <w:t>documentelor</w:t>
+      </w:r>
+      <w:proofErr w:type="spellEnd"/>
+      <w:r>
+        <w:t xml:space="preserve"> </w:t>
+      </w:r>
+      <w:proofErr w:type="spellStart"/>
+      <w:r>
+        <w:t>asociate</w:t>
+      </w:r>
+      <w:proofErr w:type="spellEnd"/>
+      <w:r>
+        <w:t xml:space="preserve"> </w:t>
+      </w:r>
+      <w:proofErr w:type="spellStart"/>
+      <w:r>
+        <w:t>fiecarui</w:t>
+      </w:r>
+      <w:proofErr w:type="spellEnd"/>
+      <w:r>
+        <w:t xml:space="preserve"> </w:t>
+      </w:r>
+      <w:proofErr w:type="spellStart"/>
+      <w:r>
+        <w:t>dosar</w:t>
+      </w:r>
+      <w:proofErr w:type="spellEnd"/>
+      <w:r>
+        <w:t>;</w:t>
       </w:r>
     </w:p>
     <w:p>
       <w:pPr>
         <w:pStyle w:val="Heading2"/>
       </w:pPr>
-      <w:bookmarkStart w:id="6" w:name="_Toc242997832"/>
-      <w:r>
-        <w:t>2.2 Operatii</w:t>
+      <w:bookmarkStart w:id="6" w:name="_Toc243476265"/>
+      <w:r>
+        <w:t xml:space="preserve">2.2 </w:t>
+      </w:r>
+      <w:proofErr w:type="spellStart"/>
+      <w:r>
+        <w:t>Operatii</w:t>
       </w:r>
       <w:bookmarkEnd w:id="6"/>
+      <w:proofErr w:type="spellEnd"/>
+    </w:p>
+    <w:p>
+      <w:pPr>
+        <w:pStyle w:val="NoSpacing"/>
+      </w:pPr>
+      <w:r>
+        <w:tab/>
+        <w:t>Asupra bazei de date a sistemului JuriDesk se efectueaza operatii CRUD si proceduri specifice domeniului juridic:</w:t>
+      </w:r>
+    </w:p>
+    <w:p>
+      <w:pPr>
+        <w:pStyle w:val="NoSpacing"/>
+        <w:ind w:firstLine="720"/>
+      </w:pPr>
+      <w:r>
+        <w:t>-Operatii de adaugare:</w:t>
+      </w:r>
+    </w:p>
+    <w:p>
+      <w:pPr>
+        <w:pStyle w:val="NoSpacing"/>
+      </w:pPr>
+      <w:r>
+        <w:tab/>
+      </w:r>
+      <w:r>
+        <w:tab/>
+        <w:t>-Inregistrarea clientilor noi si adaugarea datelor de contact;</w:t>
+      </w:r>
+    </w:p>
+    <w:p>
+      <w:pPr>
+        <w:pStyle w:val="NoSpacing"/>
+      </w:pPr>
+      <w:r>
+        <w:tab/>
+      </w:r>
+      <w:r>
+        <w:tab/>
+        <w:t>-Deschiderea unui dosar nou si repartizarea unei echipe de avocati;</w:t>
+      </w:r>
+    </w:p>
+    <w:p>
+      <w:pPr>
+        <w:pStyle w:val="NoSpacing"/>
+      </w:pPr>
+      <w:r>
+        <w:tab/>
+      </w:r>
+      <w:r>
+        <w:tab/>
+        <w:t>-Programarea unui termen de judecata;</w:t>
+      </w:r>
+    </w:p>
+    <w:p>
+      <w:pPr>
+        <w:pStyle w:val="NoSpacing"/>
+      </w:pPr>
+      <w:r>
+        <w:tab/>
+      </w:r>
+      <w:r>
+        <w:tab/>
+        <w:t>-Incarcarea referintelor catre documente;</w:t>
+      </w:r>
+    </w:p>
+    <w:p>
+      <w:pPr>
+        <w:pStyle w:val="NoSpacing"/>
+      </w:pPr>
+      <w:r>
+        <w:tab/>
+      </w:r>
+      <w:r>
+        <w:tab/>
+        <w:t>-</w:t>
+      </w:r>
+      <w:r>
+        <w:t>Emiterea facturilor si inregistrarea incasarilor</w:t>
+      </w:r>
+    </w:p>
+    <w:p>
+      <w:pPr>
+        <w:pStyle w:val="NoSpacing"/>
+      </w:pPr>
+      <w:r>
+        <w:tab/>
+        <w:t>-Operatiuni de citire:</w:t>
+      </w:r>
+    </w:p>
+    <w:p>
+      <w:pPr>
+        <w:pStyle w:val="NoSpacing"/>
+      </w:pPr>
+      <w:r>
+        <w:tab/>
+      </w:r>
+      <w:r>
+        <w:tab/>
+        <w:t>-Cautarea rapida a dosarelor dupa numarul de dosar, instanta sau client;</w:t>
+      </w:r>
+    </w:p>
+    <w:p>
+      <w:pPr>
+        <w:pStyle w:val="NoSpacing"/>
+      </w:pPr>
+      <w:r>
+        <w:tab/>
+      </w:r>
+      <w:r>
+        <w:tab/>
+        <w:t>-Filtrarea termenelor procedurale scadente in luna curenta;</w:t>
+      </w:r>
+    </w:p>
+    <w:p>
+      <w:pPr>
+        <w:pStyle w:val="NoSpacing"/>
+      </w:pPr>
+      <w:r>
+        <w:tab/>
+      </w:r>
+      <w:r>
+        <w:tab/>
+        <w:t>-Vizualizarea isotricului unui dosar;</w:t>
+      </w:r>
+    </w:p>
+    <w:p>
+      <w:pPr>
+        <w:pStyle w:val="NoSpacing"/>
+      </w:pPr>
+      <w:r>
+        <w:tab/>
+        <w:t>-Operatiuni de modificare:</w:t>
+      </w:r>
+    </w:p>
+    <w:p>
+      <w:pPr>
+        <w:pStyle w:val="NoSpacing"/>
+      </w:pPr>
+      <w:r>
+        <w:tab/>
+      </w:r>
+      <w:r>
+        <w:tab/>
+        <w:t>-Actualizarea starii dosarului si a stadiului procesual;</w:t>
+      </w:r>
+    </w:p>
+    <w:p>
+      <w:pPr>
+        <w:pStyle w:val="NoSpacing"/>
+      </w:pPr>
+      <w:r>
+        <w:tab/>
+      </w:r>
+      <w:r>
+        <w:tab/>
+        <w:t>-Modificarea starii unui termen;</w:t>
+      </w:r>
+    </w:p>
+    <w:p>
+      <w:pPr>
+        <w:pStyle w:val="NoSpacing"/>
+      </w:pPr>
+      <w:r>
+        <w:tab/>
+      </w:r>
+      <w:r>
+        <w:tab/>
+        <w:t>-Actualizarea datelor de contact a unui client;</w:t>
+      </w:r>
+    </w:p>
+    <w:p>
+      <w:pPr>
+        <w:pStyle w:val="NoSpacing"/>
+      </w:pPr>
+      <w:r>
+        <w:tab/>
+      </w:r>
+      <w:r>
+        <w:tab/>
+        <w:t>-Schimbarea starii facturii la incasare;</w:t>
+      </w:r>
+    </w:p>
+    <w:p>
+      <w:pPr>
+        <w:pStyle w:val="NoSpacing"/>
+      </w:pPr>
+      <w:r>
+        <w:tab/>
+        <w:t>-Operatiuni de stergere:</w:t>
+      </w:r>
+    </w:p>
+    <w:p>
+      <w:pPr>
+        <w:pStyle w:val="NoSpacing"/>
+      </w:pPr>
+      <w:r>
+        <w:tab/>
+      </w:r>
+      <w:r>
+        <w:tab/>
+        <w:t>-Deactivarea conturilor;</w:t>
+      </w:r>
+    </w:p>
+    <w:p>
+      <w:pPr>
+        <w:pStyle w:val="NoSpacing"/>
+      </w:pPr>
+      <w:r>
+        <w:tab/>
+      </w:r>
+      <w:r>
+        <w:tab/>
+        <w:t>-Revocarea unui avocat dintr-un dosar;</w:t>
+      </w:r>
+    </w:p>
+    <w:p>
+      <w:pPr>
+        <w:pStyle w:val="NoSpacing"/>
+      </w:pPr>
+      <w:r>
+        <w:tab/>
+      </w:r>
+      <w:r>
+        <w:tab/>
+        <w:t>-Arhivarea dosarelor inchise;</w:t>
+      </w:r>
+      <w:r>
+        <w:t xml:space="preserve"> </w:t>
+      </w:r>
     </w:p>
     <w:p>
       <w:pPr>
         <w:pStyle w:val="Heading2"/>
       </w:pPr>
-      <w:bookmarkStart w:id="7" w:name="_Toc242997833"/>
-      <w:r>
-        <w:t>2.3 Utilizatori</w:t>
+      <w:bookmarkStart w:id="7" w:name="_Toc243476266"/>
+      <w:r>
+        <w:lastRenderedPageBreak/>
+        <w:t xml:space="preserve">2.3 </w:t>
+      </w:r>
+      <w:proofErr w:type="spellStart"/>
+      <w:r>
+        <w:t>Utilizatori</w:t>
       </w:r>
       <w:bookmarkEnd w:id="7"/>
+      <w:proofErr w:type="spellEnd"/>
     </w:p>
     <w:p>
       <w:r>
@@ -1181,16 +2054,867 @@
       </w:pPr>
     </w:p>
     <w:p>
-      <w:pPr>
-        <w:ind w:left="720"/>
-      </w:pPr>
-      <w:r>
+      <w:r>
+        <w:br w:type="page"/>
+      </w:r>
+    </w:p>
+    <w:p>
+      <w:pPr>
+        <w:pStyle w:val="Heading1"/>
+      </w:pPr>
+      <w:bookmarkStart w:id="8" w:name="_Toc243476267"/>
+      <w:r>
+        <w:lastRenderedPageBreak/>
+        <w:t xml:space="preserve">3. </w:t>
+      </w:r>
+      <w:proofErr w:type="spellStart"/>
+      <w:r>
+        <w:t>Proiectare</w:t>
+      </w:r>
+      <w:bookmarkEnd w:id="8"/>
+      <w:proofErr w:type="spellEnd"/>
+    </w:p>
+    <w:p>
+      <w:pPr>
+        <w:pStyle w:val="NoSpacing"/>
+      </w:pPr>
+      <w:r>
+        <w:tab/>
+        <w:t>In acest capitol se prezinta cerintele functionale ale cabinetului de avocatura, asigurand suportul structural pentru aplicatia JuriDesk. In cadrul capitolului sunt mentionate specificatiile si este detaliata schema conceptuala a bazei de date.</w:t>
+      </w:r>
+    </w:p>
+    <w:p>
+      <w:pPr>
+        <w:pStyle w:val="Heading2"/>
+      </w:pPr>
+      <w:bookmarkStart w:id="9" w:name="_Toc243476268"/>
+      <w:r>
+        <w:t xml:space="preserve">3.1 Analiza </w:t>
+      </w:r>
+      <w:proofErr w:type="spellStart"/>
+      <w:r>
+        <w:t>cerintelor</w:t>
+      </w:r>
+      <w:bookmarkEnd w:id="9"/>
+      <w:proofErr w:type="spellEnd"/>
+    </w:p>
+    <w:p>
+      <w:pPr>
+        <w:pStyle w:val="NoSpacing"/>
+      </w:pPr>
+      <w:r>
+        <w:tab/>
+        <w:t xml:space="preserve"> Aceasta etapa defineste actorii implicati, cerintele functionale cat si cele non-functionale de perfomanta si siguranta.</w:t>
+      </w:r>
+    </w:p>
+    <w:p>
+      <w:pPr>
+        <w:pStyle w:val="Heading3"/>
+      </w:pPr>
+    </w:p>
+    <w:p>
+      <w:pPr>
+        <w:pStyle w:val="Heading3"/>
+        <w:rPr>
+          <w:color w:val="000000" w:themeColor="text1"/>
+        </w:rPr>
+      </w:pPr>
+      <w:bookmarkStart w:id="10" w:name="_Toc243476269"/>
+      <w:r>
+        <w:rPr>
+          <w:color w:val="000000" w:themeColor="text1"/>
+        </w:rPr>
+        <w:t xml:space="preserve">3.1.1 </w:t>
+      </w:r>
+      <w:proofErr w:type="spellStart"/>
+      <w:r>
+        <w:rPr>
+          <w:color w:val="000000" w:themeColor="text1"/>
+        </w:rPr>
+        <w:t>Actorii</w:t>
+      </w:r>
+      <w:proofErr w:type="spellEnd"/>
+      <w:r>
+        <w:rPr>
+          <w:color w:val="000000" w:themeColor="text1"/>
+        </w:rPr>
         <w:t xml:space="preserve"> </w:t>
       </w:r>
+      <w:proofErr w:type="spellStart"/>
+      <w:r>
+        <w:rPr>
+          <w:color w:val="000000" w:themeColor="text1"/>
+        </w:rPr>
+        <w:t>sistemului</w:t>
+      </w:r>
+      <w:bookmarkEnd w:id="10"/>
+      <w:proofErr w:type="spellEnd"/>
+    </w:p>
+    <w:p>
+      <w:pPr>
+        <w:pStyle w:val="NoSpacing"/>
+      </w:pPr>
+      <w:r>
+        <w:tab/>
+      </w:r>
+      <w:r>
+        <w:t>Administrator/Avocat titular: gestioneaza conturile personalului, rolurile din sistem si are acces complet la toate registrele juridice si financiare ale cabinetului.</w:t>
+      </w:r>
+    </w:p>
+    <w:p>
+      <w:pPr>
+        <w:pStyle w:val="NoSpacing"/>
+      </w:pPr>
+      <w:r>
+        <w:tab/>
+        <w:t>Avocat colaborator: are acces doar la dosarele, termenele si documentele la care a fost desemnat.</w:t>
+      </w:r>
+    </w:p>
+    <w:p>
+      <w:pPr>
+        <w:pStyle w:val="NoSpacing"/>
+      </w:pPr>
+      <w:r>
+        <w:tab/>
+        <w:t>Personal administrativ: se ocupa de registratura de documente, modulul de facturare si de modulul de clienti.</w:t>
+      </w:r>
+    </w:p>
+    <w:p>
+      <w:pPr>
+        <w:pStyle w:val="NoSpacing"/>
+      </w:pPr>
+    </w:p>
+    <w:p>
+      <w:pPr>
+        <w:pStyle w:val="Heading3"/>
+        <w:rPr>
+          <w:color w:val="000000" w:themeColor="text1"/>
+        </w:rPr>
+      </w:pPr>
+      <w:bookmarkStart w:id="11" w:name="_Toc243476270"/>
+      <w:r>
+        <w:rPr>
+          <w:color w:val="000000" w:themeColor="text1"/>
+        </w:rPr>
+        <w:t xml:space="preserve">3.1.2 </w:t>
+      </w:r>
+      <w:proofErr w:type="spellStart"/>
+      <w:r>
+        <w:rPr>
+          <w:color w:val="000000" w:themeColor="text1"/>
+        </w:rPr>
+        <w:t>Cerinte</w:t>
+      </w:r>
+      <w:proofErr w:type="spellEnd"/>
+      <w:r>
+        <w:rPr>
+          <w:color w:val="000000" w:themeColor="text1"/>
+        </w:rPr>
+        <w:t xml:space="preserve"> </w:t>
+      </w:r>
+      <w:proofErr w:type="spellStart"/>
+      <w:r>
+        <w:rPr>
+          <w:color w:val="000000" w:themeColor="text1"/>
+        </w:rPr>
+        <w:t>functionale</w:t>
+      </w:r>
+      <w:bookmarkEnd w:id="11"/>
+      <w:proofErr w:type="spellEnd"/>
+    </w:p>
+    <w:p>
+      <w:pPr>
+        <w:pStyle w:val="NoSpacing"/>
+      </w:pPr>
+      <w:r>
+        <w:tab/>
+        <w:t>1. Gestiunea securitatii si autentificarii: sistemul permite autentificarea unica pe baza de email si parola prin functia de hash, dar verfica starea contului inainte de a acorda acces.</w:t>
+      </w:r>
+    </w:p>
+    <w:p>
+      <w:pPr>
+        <w:pStyle w:val="NoSpacing"/>
+      </w:pPr>
+      <w:r>
+        <w:tab/>
+        <w:t>2. Administrarea clientilor: crearea si actualizarea fiselor de clienti, validarea unicitatii si asocierea mai multor metode de contact.</w:t>
+      </w:r>
+    </w:p>
+    <w:p>
+      <w:pPr>
+        <w:pStyle w:val="NoSpacing"/>
+      </w:pPr>
+      <w:r>
+        <w:tab/>
+        <w:t>3. Administrarea dosarelor si alocarea resurselor: inregistreaza numarul unic de dosar, stabileste obiectivul, instanta si faza procedurala si apoi poate asocia un colectiv de avocati</w:t>
+      </w:r>
+      <w:r>
+        <w:t xml:space="preserve"> dosarului.</w:t>
+      </w:r>
+    </w:p>
+    <w:p>
+      <w:pPr>
+        <w:pStyle w:val="NoSpacing"/>
+      </w:pPr>
+      <w:r>
+        <w:tab/>
+        <w:t>4. Agenda si termene procedurale: programarea termenelor de judecata si a intalnirilor cu clienti si marcarea starii curente a termenului.</w:t>
+      </w:r>
+    </w:p>
+    <w:p>
+      <w:pPr>
+        <w:pStyle w:val="NoSpacing"/>
+      </w:pPr>
+      <w:r>
+        <w:tab/>
+        <w:t>5. Registratura electronica a documentelor:</w:t>
+      </w:r>
+      <w:r>
+        <w:t xml:space="preserve"> </w:t>
+      </w:r>
+      <w:r>
+        <w:t>permite salvarea cailor catre fisierele stocate si clasificarea acestora.</w:t>
+      </w:r>
+    </w:p>
+    <w:p>
+      <w:pPr>
+        <w:pStyle w:val="NoSpacing"/>
+      </w:pPr>
+      <w:r>
+        <w:tab/>
+        <w:t>6. Evidenta financiara: generarea automata a facturilor pe baza dosarului si inregistrarea platilor in rate sau integral.</w:t>
+      </w:r>
+    </w:p>
+    <w:p>
+      <w:pPr>
+        <w:pStyle w:val="NoSpacing"/>
+      </w:pPr>
+    </w:p>
+    <w:p>
+      <w:pPr>
+        <w:pStyle w:val="Heading3"/>
+        <w:rPr>
+          <w:color w:val="000000" w:themeColor="text1"/>
+        </w:rPr>
+      </w:pPr>
+      <w:bookmarkStart w:id="12" w:name="_Toc243476271"/>
+      <w:r>
+        <w:rPr>
+          <w:color w:val="000000" w:themeColor="text1"/>
+        </w:rPr>
+        <w:t xml:space="preserve">3.1.3 </w:t>
+      </w:r>
+      <w:proofErr w:type="spellStart"/>
+      <w:r>
+        <w:rPr>
+          <w:color w:val="000000" w:themeColor="text1"/>
+        </w:rPr>
+        <w:t>Cerinte</w:t>
+      </w:r>
+      <w:proofErr w:type="spellEnd"/>
+      <w:r>
+        <w:rPr>
+          <w:color w:val="000000" w:themeColor="text1"/>
+        </w:rPr>
+        <w:t xml:space="preserve"> non-</w:t>
+      </w:r>
+      <w:proofErr w:type="spellStart"/>
+      <w:r>
+        <w:rPr>
+          <w:color w:val="000000" w:themeColor="text1"/>
+        </w:rPr>
+        <w:t>functionale</w:t>
+      </w:r>
+      <w:bookmarkEnd w:id="12"/>
+      <w:proofErr w:type="spellEnd"/>
+    </w:p>
+    <w:p>
+      <w:pPr>
+        <w:pStyle w:val="NoSpacing"/>
+      </w:pPr>
+      <w:r>
+        <w:tab/>
+        <w:t>1. Securitate: parolele nu sunt stocate crud, si sunt bagata intr-un hash.</w:t>
+      </w:r>
+    </w:p>
+    <w:p>
+      <w:pPr>
+        <w:pStyle w:val="NoSpacing"/>
+      </w:pPr>
+      <w:r>
+        <w:tab/>
+        <w:t>2. Integritate si consistenta: aplicarea constrangerilor de integritate si utilizarea constrangerilor de unicitate.</w:t>
+      </w:r>
+    </w:p>
+    <w:p>
+      <w:pPr>
+        <w:pStyle w:val="NoSpacing"/>
+      </w:pPr>
+      <w:r>
+        <w:tab/>
+        <w:t>3. Performanta: optimizarea timpilor de cautare prin indexi.</w:t>
+      </w:r>
+    </w:p>
+    <w:p>
+      <w:pPr>
+        <w:pStyle w:val="Heading2"/>
+      </w:pPr>
+      <w:bookmarkStart w:id="13" w:name="_Toc243476272"/>
+      <w:r>
+        <w:t>3.2 Model ER</w:t>
+      </w:r>
+      <w:bookmarkEnd w:id="13"/>
+      <w:r>
+        <w:tab/>
+      </w:r>
+    </w:p>
+    <w:p>
+      <w:pPr>
+        <w:pStyle w:val="NoSpacing"/>
+      </w:pPr>
+      <w:r>
+        <w:tab/>
+      </w:r>
+      <w:r>
+        <w:t xml:space="preserve">Modelul Entitate-Relatie defineste nivelul conceptual al bazei de date JuriDesk. </w:t>
+      </w:r>
+    </w:p>
+    <w:p>
+      <w:pPr>
+        <w:pStyle w:val="NoSpacing"/>
+      </w:pPr>
+      <w:r>
+        <w:rPr>
+          <w:noProof/>
+        </w:rPr>
+        <w:lastRenderedPageBreak/>
+        <w:drawing>
+          <wp:inline distT="0" distB="0" distL="0" distR="0" wp14:anchorId="6EEC5A8A" wp14:editId="7ED78D0F">
+            <wp:extent cx="5760720" cy="3961765"/>
+            <wp:effectExtent l="0" t="0" r="0" b="635"/>
+            <wp:docPr id="1664252697" name="Picture 1"/>
+            <wp:cNvGraphicFramePr>
+              <a:graphicFrameLocks xmlns:a="http://schemas.openxmlformats.org/drawingml/2006/main" noChangeAspect="1"/>
+            </wp:cNvGraphicFramePr>
+            <a:graphic xmlns:a="http://schemas.openxmlformats.org/drawingml/2006/main">
+              <a:graphicData uri="http://schemas.openxmlformats.org/drawingml/2006/picture">
+                <pic:pic xmlns:pic="http://schemas.openxmlformats.org/drawingml/2006/picture">
+                  <pic:nvPicPr>
+                    <pic:cNvPr id="1664252697" name=""/>
+                    <pic:cNvPicPr/>
+                  </pic:nvPicPr>
+                  <pic:blipFill>
+                    <a:blip r:embed="rId8"/>
+                    <a:stretch>
+                      <a:fillRect/>
+                    </a:stretch>
+                  </pic:blipFill>
+                  <pic:spPr>
+                    <a:xfrm>
+                      <a:off x="0" y="0"/>
+                      <a:ext cx="5760720" cy="3961765"/>
+                    </a:xfrm>
+                    <a:prstGeom prst="rect">
+                      <a:avLst/>
+                    </a:prstGeom>
+                  </pic:spPr>
+                </pic:pic>
+              </a:graphicData>
+            </a:graphic>
+          </wp:inline>
+        </w:drawing>
+      </w:r>
+    </w:p>
+    <w:p>
+      <w:pPr>
+        <w:pStyle w:val="ListParagraph"/>
+        <w:jc w:val="center"/>
+      </w:pPr>
+      <w:proofErr w:type="spellStart"/>
+      <w:r>
+        <w:t>Figura</w:t>
+      </w:r>
+      <w:proofErr w:type="spellEnd"/>
+      <w:r>
+        <w:t xml:space="preserve"> </w:t>
+      </w:r>
+      <w:r>
+        <w:t>3.</w:t>
+      </w:r>
+      <w:r>
+        <w:t>1</w:t>
+      </w:r>
+      <w:r>
+        <w:t xml:space="preserve"> </w:t>
+      </w:r>
+      <w:proofErr w:type="spellStart"/>
+      <w:r>
+        <w:t>Diagrama</w:t>
+      </w:r>
+      <w:proofErr w:type="spellEnd"/>
+      <w:r>
+        <w:t xml:space="preserve"> ER </w:t>
+      </w:r>
+      <w:proofErr w:type="gramStart"/>
+      <w:r>
+        <w:t>a</w:t>
+      </w:r>
+      <w:proofErr w:type="gramEnd"/>
+      <w:r>
+        <w:t xml:space="preserve"> </w:t>
+      </w:r>
+      <w:proofErr w:type="spellStart"/>
+      <w:r>
+        <w:t>aplicatiei</w:t>
+      </w:r>
+      <w:proofErr w:type="spellEnd"/>
+      <w:r>
+        <w:t xml:space="preserve"> </w:t>
+      </w:r>
+      <w:proofErr w:type="spellStart"/>
+      <w:r>
+        <w:t>JuriDesk</w:t>
+      </w:r>
+      <w:proofErr w:type="spellEnd"/>
+    </w:p>
+    <w:p>
+      <w:pPr>
+        <w:pStyle w:val="ListParagraph"/>
+        <w:jc w:val="center"/>
+      </w:pPr>
+    </w:p>
+    <w:p>
+      <w:pPr>
+        <w:pStyle w:val="Heading3"/>
+        <w:rPr>
+          <w:color w:val="auto"/>
+        </w:rPr>
+      </w:pPr>
+      <w:r>
+        <w:rPr>
+          <w:color w:val="auto"/>
+        </w:rPr>
+        <w:t xml:space="preserve">3.2.1 </w:t>
+      </w:r>
+      <w:proofErr w:type="spellStart"/>
+      <w:r>
+        <w:rPr>
+          <w:color w:val="auto"/>
+        </w:rPr>
+        <w:t>Descrierea</w:t>
+      </w:r>
+      <w:proofErr w:type="spellEnd"/>
+      <w:r>
+        <w:rPr>
+          <w:color w:val="auto"/>
+        </w:rPr>
+        <w:t xml:space="preserve"> </w:t>
+      </w:r>
+      <w:proofErr w:type="spellStart"/>
+      <w:r>
+        <w:rPr>
+          <w:color w:val="auto"/>
+        </w:rPr>
+        <w:t>entitatilor</w:t>
+      </w:r>
+      <w:proofErr w:type="spellEnd"/>
+      <w:r>
+        <w:rPr>
+          <w:color w:val="auto"/>
+        </w:rPr>
+        <w:t xml:space="preserve"> </w:t>
+      </w:r>
+      <w:proofErr w:type="spellStart"/>
+      <w:r>
+        <w:rPr>
+          <w:color w:val="auto"/>
+        </w:rPr>
+        <w:t>si</w:t>
+      </w:r>
+      <w:proofErr w:type="spellEnd"/>
+      <w:r>
+        <w:rPr>
+          <w:color w:val="auto"/>
+        </w:rPr>
+        <w:t xml:space="preserve"> </w:t>
+      </w:r>
+      <w:proofErr w:type="gramStart"/>
+      <w:r>
+        <w:rPr>
+          <w:color w:val="auto"/>
+        </w:rPr>
+        <w:t>a</w:t>
+      </w:r>
+      <w:proofErr w:type="gramEnd"/>
+      <w:r>
+        <w:rPr>
+          <w:color w:val="auto"/>
+        </w:rPr>
+        <w:t xml:space="preserve"> </w:t>
+      </w:r>
+      <w:proofErr w:type="spellStart"/>
+      <w:r>
+        <w:rPr>
+          <w:color w:val="auto"/>
+        </w:rPr>
+        <w:t>atributelor</w:t>
+      </w:r>
+      <w:proofErr w:type="spellEnd"/>
+    </w:p>
+    <w:p>
+      <w:pPr>
+        <w:pStyle w:val="NoSpacing"/>
+      </w:pPr>
+      <w:r>
+        <w:t>Modelul conceptual include 11 entitati proiectate pentru a curpinde fluxul juridic, administrativ si cel financiar.</w:t>
+      </w:r>
+    </w:p>
+    <w:p>
+      <w:pPr>
+        <w:pStyle w:val="NoSpacing"/>
+      </w:pPr>
+    </w:p>
+    <w:p>
+      <w:pPr>
+        <w:pStyle w:val="NoSpacing"/>
+      </w:pPr>
+      <w:r>
+        <w:t>UTILIZATOR: personalul cabinetului de avocatura care sunt autorizati sa utilizeze sistemul. Nu include clienti.</w:t>
+      </w:r>
+    </w:p>
+    <w:p>
+      <w:pPr>
+        <w:pStyle w:val="NoSpacing"/>
+      </w:pPr>
+      <w:r>
+        <w:t>Atribute:</w:t>
+      </w:r>
+    </w:p>
+    <w:p>
+      <w:pPr>
+        <w:pStyle w:val="NoSpacing"/>
+      </w:pPr>
+      <w:r>
+        <w:tab/>
+        <w:t>-id_utlizator: identificatorul unic al utilizatorului, PK;</w:t>
+      </w:r>
+    </w:p>
+    <w:p>
+      <w:pPr>
+        <w:pStyle w:val="NoSpacing"/>
+      </w:pPr>
+      <w:r>
+        <w:tab/>
+        <w:t>-nume,prenume: datele de identificare ale utilizatorului;</w:t>
+      </w:r>
+    </w:p>
+    <w:p>
+      <w:pPr>
+        <w:pStyle w:val="NoSpacing"/>
+      </w:pPr>
+      <w:r>
+        <w:tab/>
+        <w:t>-email: adresa de email prin care utilizatorul poate fi contact dar si autentificator de logare;</w:t>
+      </w:r>
+    </w:p>
+    <w:p>
+      <w:pPr>
+        <w:pStyle w:val="NoSpacing"/>
+      </w:pPr>
+      <w:r>
+        <w:tab/>
+        <w:t>-telefon: numar de contact;</w:t>
+      </w:r>
+    </w:p>
+    <w:p>
+      <w:pPr>
+        <w:pStyle w:val="NoSpacing"/>
+      </w:pPr>
+      <w:r>
+        <w:tab/>
+        <w:t>-rol: rolul in cadrul platformei. Poate fi titular,colaborator sau secretar;</w:t>
+      </w:r>
+    </w:p>
+    <w:p>
+      <w:pPr>
+        <w:pStyle w:val="NoSpacing"/>
+      </w:pPr>
+      <w:r>
+        <w:tab/>
+        <w:t>-parola_hash: parola salvata a contului dupa trecerea printr-un hash;</w:t>
+      </w:r>
+    </w:p>
+    <w:p>
+      <w:pPr>
+        <w:pStyle w:val="NoSpacing"/>
+      </w:pPr>
+      <w:r>
+        <w:tab/>
+        <w:t>-activ: indicator daca contul este activ sau nu;</w:t>
+      </w:r>
+    </w:p>
+    <w:p>
+      <w:pPr>
+        <w:pStyle w:val="NoSpacing"/>
+      </w:pPr>
+    </w:p>
+    <w:p>
+      <w:pPr>
+        <w:pStyle w:val="NoSpacing"/>
+      </w:pPr>
+      <w:r>
+        <w:t>CLIENT: reprezinta persoanele reprezentate de cabinet.</w:t>
+      </w:r>
+    </w:p>
+    <w:p>
+      <w:pPr>
+        <w:pStyle w:val="NoSpacing"/>
+      </w:pPr>
+      <w:r>
+        <w:t>Atribute:</w:t>
+      </w:r>
+    </w:p>
+    <w:p>
+      <w:pPr>
+        <w:pStyle w:val="NoSpacing"/>
+      </w:pPr>
+      <w:r>
+        <w:tab/>
+      </w:r>
+      <w:r>
+        <w:t>-id_client: identificatorul unic al clientului, PK;</w:t>
+      </w:r>
+    </w:p>
+    <w:p>
+      <w:pPr>
+        <w:pStyle w:val="NoSpacing"/>
+        <w:ind w:firstLine="720"/>
+      </w:pPr>
+      <w:r>
+        <w:t>-tip_client: tipul clientului, persoana fizica sau persoana juridica;</w:t>
+      </w:r>
+    </w:p>
+    <w:p>
+      <w:pPr>
+        <w:pStyle w:val="NoSpacing"/>
+        <w:ind w:firstLine="720"/>
+      </w:pPr>
+      <w:r>
+        <w:t>-nume_denumire: numele complet sau denumirea oficiala a clientului;</w:t>
+      </w:r>
+    </w:p>
+    <w:p>
+      <w:pPr>
+        <w:pStyle w:val="NoSpacing"/>
+        <w:ind w:firstLine="720"/>
+      </w:pPr>
+      <w:r>
+        <w:t xml:space="preserve">-cnp_cui: codul numeric personal sau codul unic de identificare fiscala; </w:t>
+      </w:r>
+    </w:p>
+    <w:p>
+      <w:pPr>
+        <w:pStyle w:val="NoSpacing"/>
+        <w:ind w:firstLine="720"/>
+      </w:pPr>
+      <w:r>
+        <w:t xml:space="preserve">-adresa: domiciliul </w:t>
+      </w:r>
+      <w:r>
+        <w:t>clientului</w:t>
+      </w:r>
+      <w:r>
+        <w:t xml:space="preserve">; </w:t>
+      </w:r>
+    </w:p>
+    <w:p>
+      <w:pPr>
+        <w:pStyle w:val="NoSpacing"/>
+        <w:ind w:firstLine="720"/>
+      </w:pPr>
+      <w:r>
+        <w:t>-data_inregistrare: data la care clientul a fost inregistrat in sistem;</w:t>
+      </w:r>
+    </w:p>
+    <w:p>
+      <w:pPr>
+        <w:pStyle w:val="NoSpacing"/>
+      </w:pPr>
+      <w:r>
+        <w:lastRenderedPageBreak/>
+        <w:t xml:space="preserve">CONTACT_CLIENT: </w:t>
+      </w:r>
+      <w:r>
+        <w:t>salveaza modalitatile de comunicare pentru fiecare client in parte.</w:t>
+      </w:r>
+    </w:p>
+    <w:p>
+      <w:pPr>
+        <w:pStyle w:val="NoSpacing"/>
+      </w:pPr>
+      <w:r>
+        <w:t xml:space="preserve">Atribute: </w:t>
+      </w:r>
+    </w:p>
+    <w:p>
+      <w:pPr>
+        <w:pStyle w:val="NoSpacing"/>
+        <w:ind w:firstLine="720"/>
+      </w:pPr>
+      <w:r>
+        <w:t xml:space="preserve">-id_contact: identificatorul unic al intrarii de contact, PK; </w:t>
+      </w:r>
+    </w:p>
+    <w:p>
+      <w:pPr>
+        <w:pStyle w:val="NoSpacing"/>
+        <w:ind w:firstLine="720"/>
+      </w:pPr>
+      <w:r>
+        <w:t xml:space="preserve">-id_client: identificatorul clientului caruia ii apartine contactul, FK; </w:t>
+      </w:r>
+    </w:p>
+    <w:p>
+      <w:pPr>
+        <w:pStyle w:val="NoSpacing"/>
+        <w:ind w:firstLine="720"/>
+      </w:pPr>
+      <w:r>
+        <w:t>-tip_contact:</w:t>
+      </w:r>
+      <w:r>
+        <w:t>tipul de contact, adica telefon sau mail</w:t>
+      </w:r>
+      <w:r>
+        <w:t xml:space="preserve">; </w:t>
+      </w:r>
+    </w:p>
+    <w:p>
+      <w:pPr>
+        <w:pStyle w:val="NoSpacing"/>
+        <w:ind w:firstLine="720"/>
+      </w:pPr>
+      <w:r>
+        <w:t xml:space="preserve">-valoare: </w:t>
+      </w:r>
+      <w:r>
+        <w:t>contactul propriu zis al clientului;</w:t>
+      </w:r>
+    </w:p>
+    <w:p>
+      <w:pPr>
+        <w:pStyle w:val="NoSpacing"/>
+        <w:ind w:firstLine="720"/>
+      </w:pPr>
+      <w:r>
+        <w:t>-principal: indicator daca este modalitatea principala de contact</w:t>
+      </w:r>
+      <w:r>
+        <w:t xml:space="preserve"> sau nu</w:t>
+      </w:r>
+      <w:r>
+        <w:t>;</w:t>
+      </w:r>
+    </w:p>
+    <w:p>
+      <w:pPr>
+        <w:pStyle w:val="NoSpacing"/>
+      </w:pPr>
+    </w:p>
+    <w:p>
+      <w:pPr>
+        <w:pStyle w:val="NoSpacing"/>
+      </w:pPr>
+      <w:r>
+        <w:t>INSTANTA:</w:t>
+      </w:r>
+      <w:r>
+        <w:t xml:space="preserve">locul </w:t>
+      </w:r>
+      <w:r>
+        <w:t xml:space="preserve">unde se desfasoara dosarele cabinetului. </w:t>
+      </w:r>
+    </w:p>
+    <w:p>
+      <w:pPr>
+        <w:pStyle w:val="NoSpacing"/>
+      </w:pPr>
+      <w:r>
+        <w:t xml:space="preserve">Atribute: </w:t>
+      </w:r>
+    </w:p>
+    <w:p>
+      <w:pPr>
+        <w:pStyle w:val="NoSpacing"/>
+        <w:ind w:firstLine="720"/>
+      </w:pPr>
+      <w:r>
+        <w:t xml:space="preserve">-id_instanta: identificatorul unic al instantei, PK; </w:t>
+      </w:r>
+    </w:p>
+    <w:p>
+      <w:pPr>
+        <w:pStyle w:val="NoSpacing"/>
+        <w:ind w:firstLine="720"/>
+      </w:pPr>
+      <w:r>
+        <w:t xml:space="preserve">-denumire: denumirea oficiala a instantei de judecata; </w:t>
+      </w:r>
+    </w:p>
+    <w:p>
+      <w:pPr>
+        <w:pStyle w:val="NoSpacing"/>
+        <w:ind w:firstLine="720"/>
+      </w:pPr>
+      <w:r>
+        <w:t xml:space="preserve">-tip_instanta: </w:t>
+      </w:r>
+      <w:r>
+        <w:t>poate fi tribunal, judecatorie sau curte de apel;</w:t>
+      </w:r>
+      <w:r>
+        <w:t xml:space="preserve"> </w:t>
+      </w:r>
+    </w:p>
+    <w:p>
+      <w:pPr>
+        <w:pStyle w:val="NoSpacing"/>
+        <w:ind w:firstLine="720"/>
+      </w:pPr>
+      <w:r>
+        <w:t>-localitate: orasul in care se afla instant</w:t>
+      </w:r>
+      <w:r>
+        <w:t>a</w:t>
+      </w:r>
+      <w:r>
+        <w:t>;</w:t>
+      </w:r>
+    </w:p>
+    <w:p>
+      <w:pPr>
+        <w:pStyle w:val="NoSpacing"/>
+        <w:ind w:firstLine="720"/>
+      </w:pPr>
+      <w:r>
+        <w:t>-adresa: adresa fizica a instantei;</w:t>
+      </w:r>
+    </w:p>
+    <w:p>
+      <w:pPr>
+        <w:pStyle w:val="NoSpacing"/>
+        <w:ind w:firstLine="720"/>
+      </w:pPr>
+    </w:p>
+    <w:p>
+      <w:pPr>
+        <w:pStyle w:val="NoSpacing"/>
+        <w:ind w:firstLine="720"/>
+      </w:pPr>
     </w:p>
     <w:sectPr>
-      <w:footerReference w:type="default" r:id="rId8"/>
-      <w:footerReference w:type="first" r:id="rId9"/>
+      <w:footerReference w:type="default" r:id="rId9"/>
+      <w:footerReference w:type="first" r:id="rId10"/>
       <w:pgSz w:w="11906" w:h="16838"/>
       <w:pgMar w:top="1417" w:right="1417" w:bottom="1417" w:left="1417" w:header="708" w:footer="708" w:gutter="0"/>
       <w:pgNumType w:start="1"/>
@@ -2068,7 +3792,6 @@
   <w:style w:type="paragraph" w:styleId="Heading3">
     <w:name w:val="heading 3"/>
     <w:uiPriority w:val="9"/>
-    <w:semiHidden/>
     <w:unhideWhenUsed/>
     <w:qFormat/>
     <w:pPr>
@@ -2122,7 +3845,6 @@
   <w:style w:type="character" w:default="1" w:styleId="DefaultParagraphFont">
     <w:name w:val="Default Paragraph Font"/>
     <w:uiPriority w:val="1"/>
-    <w:semiHidden/>
     <w:unhideWhenUsed/>
   </w:style>
   <w:style w:type="table" w:default="1" w:styleId="TableNormal">
@@ -2340,6 +4062,31 @@
     <w:rPr>
       <w:lang w:val="ro-RO"/>
     </w:rPr>
+  </w:style>
+  <w:style w:type="paragraph" w:styleId="NoSpacing">
+    <w:name w:val="No Spacing"/>
+    <w:uiPriority w:val="1"/>
+    <w:qFormat/>
+    <w:rsid w:val="00FC12F0"/>
+    <w:pPr>
+      <w:spacing w:line="240" w:lineRule="auto"/>
+    </w:pPr>
+    <w:rPr>
+      <w:lang w:val="ro-RO"/>
+    </w:rPr>
+  </w:style>
+  <w:style w:type="paragraph" w:styleId="TOC3">
+    <w:name w:val="toc 3"/>
+    <w:basedOn w:val="Normal"/>
+    <w:next w:val="Normal"/>
+    <w:autoRedefine/>
+    <w:uiPriority w:val="39"/>
+    <w:unhideWhenUsed/>
+    <w:rsid w:val="00E50F9D"/>
+    <w:pPr>
+      <w:spacing w:after="100"/>
+      <w:ind w:left="480"/>
+    </w:pPr>
   </w:style>
 </w:styles>
 </file>

</xml_diff>

<commit_message>
Am actualizat schema Chen si am adaugat descrierea entitailor
</commit_message>
<xml_diff>
--- a/docs/Ilyes_Kasian_Proiect_BD.docx
+++ b/docs/Ilyes_Kasian_Proiect_BD.docx
@@ -4,7 +4,7 @@
   <w:body>
     <w:p>
       <w:pPr>
-        <w:spacing w:before="240" w:after="40" w:line="312" w:lineRule="auto"/>
+        <w:spacing w:before="240" w:after="40"/>
         <w:jc w:val="center"/>
       </w:pPr>
       <w:r>
@@ -17,7 +17,7 @@
     </w:p>
     <w:p>
       <w:pPr>
-        <w:spacing w:after="40" w:line="312" w:lineRule="auto"/>
+        <w:spacing w:after="40"/>
         <w:jc w:val="center"/>
       </w:pPr>
       <w:r>
@@ -30,7 +30,7 @@
     </w:p>
     <w:p>
       <w:pPr>
-        <w:spacing w:after="40" w:line="312" w:lineRule="auto"/>
+        <w:spacing w:after="40"/>
         <w:jc w:val="center"/>
       </w:pPr>
       <w:r>
@@ -43,7 +43,7 @@
     </w:p>
     <w:p>
       <w:pPr>
-        <w:spacing w:after="1440" w:line="312" w:lineRule="auto"/>
+        <w:spacing w:after="1440"/>
         <w:jc w:val="center"/>
       </w:pPr>
       <w:r>
@@ -291,6 +291,7 @@
         <w:p>
           <w:pPr>
             <w:pStyle w:val="TOCHeading"/>
+            <w:spacing w:line="360" w:lineRule="auto"/>
           </w:pPr>
         </w:p>
         <w:p>
@@ -314,14 +315,14 @@
           <w:r>
             <w:fldChar w:fldCharType="separate"/>
           </w:r>
-          <w:hyperlink w:anchor="_Toc243476259" w:history="1">
+          <w:hyperlink w:anchor="_Toc244203027" w:history="1">
             <w:r>
               <w:rPr>
                 <w:rStyle w:val="Hyperlink"/>
                 <w:noProof/>
                 <w:lang w:val="ro-RO"/>
               </w:rPr>
-              <w:t>1. Scop</w:t>
+              <w:t>1.Scop</w:t>
             </w:r>
             <w:r>
               <w:rPr>
@@ -342,7 +343,7 @@
                 <w:noProof/>
                 <w:webHidden/>
               </w:rPr>
-              <w:instrText xml:space="preserve"> PAGEREF _Toc243476259 \h </w:instrText>
+              <w:instrText xml:space="preserve"> PAGEREF _Toc244203027 \h </w:instrText>
             </w:r>
             <w:r>
               <w:rPr>
@@ -383,13 +384,13 @@
               <w14:ligatures w14:val="standardContextual"/>
             </w:rPr>
           </w:pPr>
-          <w:hyperlink w:anchor="_Toc243476260" w:history="1">
+          <w:hyperlink w:anchor="_Toc244203028" w:history="1">
             <w:r>
               <w:rPr>
                 <w:rStyle w:val="Hyperlink"/>
                 <w:noProof/>
               </w:rPr>
-              <w:t>1.1. Domeniul abordat</w:t>
+              <w:t>Domeniul abordat</w:t>
             </w:r>
             <w:r>
               <w:rPr>
@@ -410,7 +411,7 @@
                 <w:noProof/>
                 <w:webHidden/>
               </w:rPr>
-              <w:instrText xml:space="preserve"> PAGEREF _Toc243476260 \h </w:instrText>
+              <w:instrText xml:space="preserve"> PAGEREF _Toc244203028 \h </w:instrText>
             </w:r>
             <w:r>
               <w:rPr>
@@ -451,14 +452,14 @@
               <w14:ligatures w14:val="standardContextual"/>
             </w:rPr>
           </w:pPr>
-          <w:hyperlink w:anchor="_Toc243476261" w:history="1">
+          <w:hyperlink w:anchor="_Toc244203029" w:history="1">
             <w:r>
               <w:rPr>
                 <w:rStyle w:val="Hyperlink"/>
                 <w:noProof/>
                 <w:lang w:val="ro-RO"/>
               </w:rPr>
-              <w:t>1.2. Problema concretă</w:t>
+              <w:t>Problema concretă</w:t>
             </w:r>
             <w:r>
               <w:rPr>
@@ -479,7 +480,7 @@
                 <w:noProof/>
                 <w:webHidden/>
               </w:rPr>
-              <w:instrText xml:space="preserve"> PAGEREF _Toc243476261 \h </w:instrText>
+              <w:instrText xml:space="preserve"> PAGEREF _Toc244203029 \h </w:instrText>
             </w:r>
             <w:r>
               <w:rPr>
@@ -520,14 +521,14 @@
               <w14:ligatures w14:val="standardContextual"/>
             </w:rPr>
           </w:pPr>
-          <w:hyperlink w:anchor="_Toc243476262" w:history="1">
+          <w:hyperlink w:anchor="_Toc244203030" w:history="1">
             <w:r>
               <w:rPr>
                 <w:rStyle w:val="Hyperlink"/>
                 <w:noProof/>
                 <w:lang w:val="ro-RO"/>
               </w:rPr>
-              <w:t>1.3. Utilitatea practică</w:t>
+              <w:t>Utilitatea practică</w:t>
             </w:r>
             <w:r>
               <w:rPr>
@@ -548,7 +549,7 @@
                 <w:noProof/>
                 <w:webHidden/>
               </w:rPr>
-              <w:instrText xml:space="preserve"> PAGEREF _Toc243476262 \h </w:instrText>
+              <w:instrText xml:space="preserve"> PAGEREF _Toc244203030 \h </w:instrText>
             </w:r>
             <w:r>
               <w:rPr>
@@ -591,7 +592,7 @@
               <w14:ligatures w14:val="standardContextual"/>
             </w:rPr>
           </w:pPr>
-          <w:hyperlink w:anchor="_Toc243476263" w:history="1">
+          <w:hyperlink w:anchor="_Toc244203031" w:history="1">
             <w:r>
               <w:rPr>
                 <w:rStyle w:val="Hyperlink"/>
@@ -618,7 +619,7 @@
                 <w:noProof/>
                 <w:webHidden/>
               </w:rPr>
-              <w:instrText xml:space="preserve"> PAGEREF _Toc243476263 \h </w:instrText>
+              <w:instrText xml:space="preserve"> PAGEREF _Toc244203031 \h </w:instrText>
             </w:r>
             <w:r>
               <w:rPr>
@@ -659,13 +660,13 @@
               <w14:ligatures w14:val="standardContextual"/>
             </w:rPr>
           </w:pPr>
-          <w:hyperlink w:anchor="_Toc243476264" w:history="1">
+          <w:hyperlink w:anchor="_Toc244203032" w:history="1">
             <w:r>
               <w:rPr>
                 <w:rStyle w:val="Hyperlink"/>
                 <w:noProof/>
               </w:rPr>
-              <w:t>2.1 Functionalitati principale</w:t>
+              <w:t>Functionalitati principale</w:t>
             </w:r>
             <w:r>
               <w:rPr>
@@ -686,7 +687,7 @@
                 <w:noProof/>
                 <w:webHidden/>
               </w:rPr>
-              <w:instrText xml:space="preserve"> PAGEREF _Toc243476264 \h </w:instrText>
+              <w:instrText xml:space="preserve"> PAGEREF _Toc244203032 \h </w:instrText>
             </w:r>
             <w:r>
               <w:rPr>
@@ -727,13 +728,13 @@
               <w14:ligatures w14:val="standardContextual"/>
             </w:rPr>
           </w:pPr>
-          <w:hyperlink w:anchor="_Toc243476265" w:history="1">
+          <w:hyperlink w:anchor="_Toc244203033" w:history="1">
             <w:r>
               <w:rPr>
                 <w:rStyle w:val="Hyperlink"/>
                 <w:noProof/>
               </w:rPr>
-              <w:t>2.2 Operatii</w:t>
+              <w:t>Operatii</w:t>
             </w:r>
             <w:r>
               <w:rPr>
@@ -754,7 +755,7 @@
                 <w:noProof/>
                 <w:webHidden/>
               </w:rPr>
-              <w:instrText xml:space="preserve"> PAGEREF _Toc243476265 \h </w:instrText>
+              <w:instrText xml:space="preserve"> PAGEREF _Toc244203033 \h </w:instrText>
             </w:r>
             <w:r>
               <w:rPr>
@@ -795,13 +796,13 @@
               <w14:ligatures w14:val="standardContextual"/>
             </w:rPr>
           </w:pPr>
-          <w:hyperlink w:anchor="_Toc243476266" w:history="1">
+          <w:hyperlink w:anchor="_Toc244203034" w:history="1">
             <w:r>
               <w:rPr>
                 <w:rStyle w:val="Hyperlink"/>
                 <w:noProof/>
               </w:rPr>
-              <w:t>2.3 Utilizatori</w:t>
+              <w:t>Utilizatori</w:t>
             </w:r>
             <w:r>
               <w:rPr>
@@ -822,7 +823,7 @@
                 <w:noProof/>
                 <w:webHidden/>
               </w:rPr>
-              <w:instrText xml:space="preserve"> PAGEREF _Toc243476266 \h </w:instrText>
+              <w:instrText xml:space="preserve"> PAGEREF _Toc244203034 \h </w:instrText>
             </w:r>
             <w:r>
               <w:rPr>
@@ -842,7 +843,7 @@
                 <w:noProof/>
                 <w:webHidden/>
               </w:rPr>
-              <w:t>2</w:t>
+              <w:t>3</w:t>
             </w:r>
             <w:r>
               <w:rPr>
@@ -865,7 +866,7 @@
               <w14:ligatures w14:val="standardContextual"/>
             </w:rPr>
           </w:pPr>
-          <w:hyperlink w:anchor="_Toc243476267" w:history="1">
+          <w:hyperlink w:anchor="_Toc244203035" w:history="1">
             <w:r>
               <w:rPr>
                 <w:rStyle w:val="Hyperlink"/>
@@ -892,7 +893,7 @@
                 <w:noProof/>
                 <w:webHidden/>
               </w:rPr>
-              <w:instrText xml:space="preserve"> PAGEREF _Toc243476267 \h </w:instrText>
+              <w:instrText xml:space="preserve"> PAGEREF _Toc244203035 \h </w:instrText>
             </w:r>
             <w:r>
               <w:rPr>
@@ -912,7 +913,7 @@
                 <w:noProof/>
                 <w:webHidden/>
               </w:rPr>
-              <w:t>3</w:t>
+              <w:t>4</w:t>
             </w:r>
             <w:r>
               <w:rPr>
@@ -933,13 +934,13 @@
               <w14:ligatures w14:val="standardContextual"/>
             </w:rPr>
           </w:pPr>
-          <w:hyperlink w:anchor="_Toc243476268" w:history="1">
+          <w:hyperlink w:anchor="_Toc244203036" w:history="1">
             <w:r>
               <w:rPr>
                 <w:rStyle w:val="Hyperlink"/>
                 <w:noProof/>
               </w:rPr>
-              <w:t>3.1 Analiza cerintelor</w:t>
+              <w:t>Analiza cerintelor</w:t>
             </w:r>
             <w:r>
               <w:rPr>
@@ -960,7 +961,7 @@
                 <w:noProof/>
                 <w:webHidden/>
               </w:rPr>
-              <w:instrText xml:space="preserve"> PAGEREF _Toc243476268 \h </w:instrText>
+              <w:instrText xml:space="preserve"> PAGEREF _Toc244203036 \h </w:instrText>
             </w:r>
             <w:r>
               <w:rPr>
@@ -980,7 +981,7 @@
                 <w:noProof/>
                 <w:webHidden/>
               </w:rPr>
-              <w:t>3</w:t>
+              <w:t>4</w:t>
             </w:r>
             <w:r>
               <w:rPr>
@@ -998,16 +999,20 @@
               <w:tab w:val="right" w:leader="dot" w:pos="9062"/>
             </w:tabs>
             <w:rPr>
+              <w:rFonts w:asciiTheme="minorHAnsi" w:eastAsiaTheme="minorEastAsia" w:hAnsiTheme="minorHAnsi" w:cstheme="minorBidi"/>
               <w:noProof/>
+              <w:kern w:val="2"/>
+              <w:lang w:val="en-US"/>
+              <w14:ligatures w14:val="standardContextual"/>
             </w:rPr>
           </w:pPr>
-          <w:hyperlink w:anchor="_Toc243476269" w:history="1">
+          <w:hyperlink w:anchor="_Toc244203037" w:history="1">
             <w:r>
               <w:rPr>
                 <w:rStyle w:val="Hyperlink"/>
                 <w:noProof/>
               </w:rPr>
-              <w:t>3.1.1 Actorii sistemului</w:t>
+              <w:t>Actorii sistemului</w:t>
             </w:r>
             <w:r>
               <w:rPr>
@@ -1028,7 +1033,7 @@
                 <w:noProof/>
                 <w:webHidden/>
               </w:rPr>
-              <w:instrText xml:space="preserve"> PAGEREF _Toc243476269 \h </w:instrText>
+              <w:instrText xml:space="preserve"> PAGEREF _Toc244203037 \h </w:instrText>
             </w:r>
             <w:r>
               <w:rPr>
@@ -1048,7 +1053,7 @@
                 <w:noProof/>
                 <w:webHidden/>
               </w:rPr>
-              <w:t>3</w:t>
+              <w:t>4</w:t>
             </w:r>
             <w:r>
               <w:rPr>
@@ -1066,16 +1071,20 @@
               <w:tab w:val="right" w:leader="dot" w:pos="9062"/>
             </w:tabs>
             <w:rPr>
+              <w:rFonts w:asciiTheme="minorHAnsi" w:eastAsiaTheme="minorEastAsia" w:hAnsiTheme="minorHAnsi" w:cstheme="minorBidi"/>
               <w:noProof/>
+              <w:kern w:val="2"/>
+              <w:lang w:val="en-US"/>
+              <w14:ligatures w14:val="standardContextual"/>
             </w:rPr>
           </w:pPr>
-          <w:hyperlink w:anchor="_Toc243476270" w:history="1">
+          <w:hyperlink w:anchor="_Toc244203038" w:history="1">
             <w:r>
               <w:rPr>
                 <w:rStyle w:val="Hyperlink"/>
                 <w:noProof/>
               </w:rPr>
-              <w:t>3.1.2 Cerinte functionale</w:t>
+              <w:t>Cerinte functionale</w:t>
             </w:r>
             <w:r>
               <w:rPr>
@@ -1096,7 +1105,7 @@
                 <w:noProof/>
                 <w:webHidden/>
               </w:rPr>
-              <w:instrText xml:space="preserve"> PAGEREF _Toc243476270 \h </w:instrText>
+              <w:instrText xml:space="preserve"> PAGEREF _Toc244203038 \h </w:instrText>
             </w:r>
             <w:r>
               <w:rPr>
@@ -1116,7 +1125,7 @@
                 <w:noProof/>
                 <w:webHidden/>
               </w:rPr>
-              <w:t>3</w:t>
+              <w:t>4</w:t>
             </w:r>
             <w:r>
               <w:rPr>
@@ -1134,16 +1143,20 @@
               <w:tab w:val="right" w:leader="dot" w:pos="9062"/>
             </w:tabs>
             <w:rPr>
+              <w:rFonts w:asciiTheme="minorHAnsi" w:eastAsiaTheme="minorEastAsia" w:hAnsiTheme="minorHAnsi" w:cstheme="minorBidi"/>
               <w:noProof/>
+              <w:kern w:val="2"/>
+              <w:lang w:val="en-US"/>
+              <w14:ligatures w14:val="standardContextual"/>
             </w:rPr>
           </w:pPr>
-          <w:hyperlink w:anchor="_Toc243476271" w:history="1">
+          <w:hyperlink w:anchor="_Toc244203039" w:history="1">
             <w:r>
               <w:rPr>
                 <w:rStyle w:val="Hyperlink"/>
                 <w:noProof/>
               </w:rPr>
-              <w:t>3.1.3 Cerinte non-functionale</w:t>
+              <w:t>Cerinte non-functionale</w:t>
             </w:r>
             <w:r>
               <w:rPr>
@@ -1164,7 +1177,7 @@
                 <w:noProof/>
                 <w:webHidden/>
               </w:rPr>
-              <w:instrText xml:space="preserve"> PAGEREF _Toc243476271 \h </w:instrText>
+              <w:instrText xml:space="preserve"> PAGEREF _Toc244203039 \h </w:instrText>
             </w:r>
             <w:r>
               <w:rPr>
@@ -1184,7 +1197,7 @@
                 <w:noProof/>
                 <w:webHidden/>
               </w:rPr>
-              <w:t>3</w:t>
+              <w:t>5</w:t>
             </w:r>
             <w:r>
               <w:rPr>
@@ -1205,13 +1218,13 @@
               <w14:ligatures w14:val="standardContextual"/>
             </w:rPr>
           </w:pPr>
-          <w:hyperlink w:anchor="_Toc243476272" w:history="1">
+          <w:hyperlink w:anchor="_Toc244203040" w:history="1">
             <w:r>
               <w:rPr>
                 <w:rStyle w:val="Hyperlink"/>
                 <w:noProof/>
               </w:rPr>
-              <w:t>3.2 Model ER</w:t>
+              <w:t>Descriere</w:t>
             </w:r>
             <w:r>
               <w:rPr>
@@ -1232,7 +1245,7 @@
                 <w:noProof/>
                 <w:webHidden/>
               </w:rPr>
-              <w:instrText xml:space="preserve"> PAGEREF _Toc243476272 \h </w:instrText>
+              <w:instrText xml:space="preserve"> PAGEREF _Toc244203040 \h </w:instrText>
             </w:r>
             <w:r>
               <w:rPr>
@@ -1252,7 +1265,143 @@
                 <w:noProof/>
                 <w:webHidden/>
               </w:rPr>
-              <w:t>3</w:t>
+              <w:t>5</w:t>
+            </w:r>
+            <w:r>
+              <w:rPr>
+                <w:noProof/>
+                <w:webHidden/>
+              </w:rPr>
+              <w:fldChar w:fldCharType="end"/>
+            </w:r>
+          </w:hyperlink>
+        </w:p>
+        <w:p>
+          <w:pPr>
+            <w:pStyle w:val="TOC2"/>
+            <w:rPr>
+              <w:rFonts w:asciiTheme="minorHAnsi" w:eastAsiaTheme="minorEastAsia" w:hAnsiTheme="minorHAnsi" w:cstheme="minorBidi"/>
+              <w:noProof/>
+              <w:kern w:val="2"/>
+              <w14:ligatures w14:val="standardContextual"/>
+            </w:rPr>
+          </w:pPr>
+          <w:hyperlink w:anchor="_Toc244203041" w:history="1">
+            <w:r>
+              <w:rPr>
+                <w:rStyle w:val="Hyperlink"/>
+                <w:noProof/>
+              </w:rPr>
+              <w:t>Model ER</w:t>
+            </w:r>
+            <w:r>
+              <w:rPr>
+                <w:noProof/>
+                <w:webHidden/>
+              </w:rPr>
+              <w:tab/>
+            </w:r>
+            <w:r>
+              <w:rPr>
+                <w:noProof/>
+                <w:webHidden/>
+              </w:rPr>
+              <w:fldChar w:fldCharType="begin"/>
+            </w:r>
+            <w:r>
+              <w:rPr>
+                <w:noProof/>
+                <w:webHidden/>
+              </w:rPr>
+              <w:instrText xml:space="preserve"> PAGEREF _Toc244203041 \h </w:instrText>
+            </w:r>
+            <w:r>
+              <w:rPr>
+                <w:noProof/>
+                <w:webHidden/>
+              </w:rPr>
+            </w:r>
+            <w:r>
+              <w:rPr>
+                <w:noProof/>
+                <w:webHidden/>
+              </w:rPr>
+              <w:fldChar w:fldCharType="separate"/>
+            </w:r>
+            <w:r>
+              <w:rPr>
+                <w:noProof/>
+                <w:webHidden/>
+              </w:rPr>
+              <w:t>5</w:t>
+            </w:r>
+            <w:r>
+              <w:rPr>
+                <w:noProof/>
+                <w:webHidden/>
+              </w:rPr>
+              <w:fldChar w:fldCharType="end"/>
+            </w:r>
+          </w:hyperlink>
+        </w:p>
+        <w:p>
+          <w:pPr>
+            <w:pStyle w:val="TOC2"/>
+            <w:rPr>
+              <w:rFonts w:asciiTheme="minorHAnsi" w:eastAsiaTheme="minorEastAsia" w:hAnsiTheme="minorHAnsi" w:cstheme="minorBidi"/>
+              <w:noProof/>
+              <w:kern w:val="2"/>
+              <w14:ligatures w14:val="standardContextual"/>
+            </w:rPr>
+          </w:pPr>
+          <w:hyperlink w:anchor="_Toc244203042" w:history="1">
+            <w:r>
+              <w:rPr>
+                <w:rStyle w:val="Hyperlink"/>
+                <w:noProof/>
+              </w:rPr>
+              <w:t>Descrierea entitatilor si a atributelor</w:t>
+            </w:r>
+            <w:r>
+              <w:rPr>
+                <w:noProof/>
+                <w:webHidden/>
+              </w:rPr>
+              <w:tab/>
+            </w:r>
+            <w:r>
+              <w:rPr>
+                <w:noProof/>
+                <w:webHidden/>
+              </w:rPr>
+              <w:fldChar w:fldCharType="begin"/>
+            </w:r>
+            <w:r>
+              <w:rPr>
+                <w:noProof/>
+                <w:webHidden/>
+              </w:rPr>
+              <w:instrText xml:space="preserve"> PAGEREF _Toc244203042 \h </w:instrText>
+            </w:r>
+            <w:r>
+              <w:rPr>
+                <w:noProof/>
+                <w:webHidden/>
+              </w:rPr>
+            </w:r>
+            <w:r>
+              <w:rPr>
+                <w:noProof/>
+                <w:webHidden/>
+              </w:rPr>
+              <w:fldChar w:fldCharType="separate"/>
+            </w:r>
+            <w:r>
+              <w:rPr>
+                <w:noProof/>
+                <w:webHidden/>
+              </w:rPr>
+              <w:t>6</w:t>
             </w:r>
             <w:r>
               <w:rPr>
@@ -1294,13 +1443,19 @@
           <w:lang w:val="ro-RO"/>
         </w:rPr>
       </w:pPr>
-      <w:bookmarkStart w:id="0" w:name="_Toc243476259"/>
+      <w:bookmarkStart w:id="0" w:name="_Toc244203027"/>
       <w:r>
         <w:rPr>
           <w:lang w:val="ro-RO"/>
         </w:rPr>
         <w:lastRenderedPageBreak/>
-        <w:t>1. Scop</w:t>
+        <w:t>1.</w:t>
+      </w:r>
+      <w:r>
+        <w:rPr>
+          <w:lang w:val="ro-RO"/>
+        </w:rPr>
+        <w:t>Scop</w:t>
       </w:r>
       <w:bookmarkEnd w:id="0"/>
     </w:p>
@@ -1323,11 +1478,21 @@
       <w:pPr>
         <w:pStyle w:val="Heading2"/>
       </w:pPr>
-      <w:bookmarkStart w:id="1" w:name="_Toc243476260"/>
-      <w:r>
-        <w:t>1.1. Domeniul abordat</w:t>
+      <w:bookmarkStart w:id="1" w:name="_Toc244203028"/>
+      <w:proofErr w:type="spellStart"/>
+      <w:r>
+        <w:t>Domeniul</w:t>
+      </w:r>
+      <w:proofErr w:type="spellEnd"/>
+      <w:r>
+        <w:t xml:space="preserve"> </w:t>
+      </w:r>
+      <w:proofErr w:type="spellStart"/>
+      <w:r>
+        <w:t>abordat</w:t>
       </w:r>
       <w:bookmarkEnd w:id="1"/>
+      <w:proofErr w:type="spellEnd"/>
     </w:p>
     <w:p>
       <w:pPr>
@@ -1363,12 +1528,12 @@
           <w:lang w:val="ro-RO"/>
         </w:rPr>
       </w:pPr>
-      <w:bookmarkStart w:id="2" w:name="_Toc243476261"/>
+      <w:bookmarkStart w:id="2" w:name="_Toc244203029"/>
       <w:r>
         <w:rPr>
           <w:lang w:val="ro-RO"/>
         </w:rPr>
-        <w:t>1.2. Problema concretă</w:t>
+        <w:t>Problema concretă</w:t>
       </w:r>
       <w:bookmarkEnd w:id="2"/>
     </w:p>
@@ -1409,12 +1574,12 @@
           <w:lang w:val="ro-RO"/>
         </w:rPr>
       </w:pPr>
-      <w:bookmarkStart w:id="3" w:name="_Toc243476262"/>
+      <w:bookmarkStart w:id="3" w:name="_Toc244203030"/>
       <w:r>
         <w:rPr>
           <w:lang w:val="ro-RO"/>
         </w:rPr>
-        <w:t>1.3. Utilitatea practică</w:t>
+        <w:t>Utilitatea practică</w:t>
       </w:r>
       <w:bookmarkEnd w:id="3"/>
     </w:p>
@@ -1450,11 +1615,16 @@
       <w:pPr>
         <w:pStyle w:val="Heading1"/>
       </w:pPr>
-      <w:bookmarkStart w:id="4" w:name="_Toc243476263"/>
-      <w:r>
-        <w:t>2. Obiective</w:t>
+      <w:bookmarkStart w:id="4" w:name="_Toc244203031"/>
+      <w:r>
+        <w:t xml:space="preserve">2. </w:t>
+      </w:r>
+      <w:proofErr w:type="spellStart"/>
+      <w:r>
+        <w:t>Obiective</w:t>
       </w:r>
       <w:bookmarkEnd w:id="4"/>
+      <w:proofErr w:type="spellEnd"/>
     </w:p>
     <w:p>
       <w:r>
@@ -1466,11 +1636,21 @@
       <w:pPr>
         <w:pStyle w:val="Heading2"/>
       </w:pPr>
-      <w:bookmarkStart w:id="5" w:name="_Toc243476264"/>
-      <w:r>
-        <w:t>2.1 Functionalitati principale</w:t>
+      <w:bookmarkStart w:id="5" w:name="_Toc244203032"/>
+      <w:proofErr w:type="spellStart"/>
+      <w:r>
+        <w:t>Functionalitati</w:t>
+      </w:r>
+      <w:proofErr w:type="spellEnd"/>
+      <w:r>
+        <w:t xml:space="preserve"> </w:t>
+      </w:r>
+      <w:proofErr w:type="spellStart"/>
+      <w:r>
+        <w:t>principale</w:t>
       </w:r>
       <w:bookmarkEnd w:id="5"/>
+      <w:proofErr w:type="spellEnd"/>
       <w:r>
         <w:t xml:space="preserve"> </w:t>
       </w:r>
@@ -1489,8 +1669,37 @@
           <w:numId w:val="3"/>
         </w:numPr>
       </w:pPr>
-      <w:r>
-        <w:t>Evidenta clientilor impreuna cu datele lor de contact;</w:t>
+      <w:proofErr w:type="spellStart"/>
+      <w:r>
+        <w:t>Evidenta</w:t>
+      </w:r>
+      <w:proofErr w:type="spellEnd"/>
+      <w:r>
+        <w:t xml:space="preserve"> </w:t>
+      </w:r>
+      <w:proofErr w:type="spellStart"/>
+      <w:r>
+        <w:t>clientilor</w:t>
+      </w:r>
+      <w:proofErr w:type="spellEnd"/>
+      <w:r>
+        <w:t xml:space="preserve"> </w:t>
+      </w:r>
+      <w:proofErr w:type="spellStart"/>
+      <w:r>
+        <w:t>impreuna</w:t>
+      </w:r>
+      <w:proofErr w:type="spellEnd"/>
+      <w:r>
+        <w:t xml:space="preserve"> cu </w:t>
+      </w:r>
+      <w:proofErr w:type="spellStart"/>
+      <w:r>
+        <w:t>datele</w:t>
+      </w:r>
+      <w:proofErr w:type="spellEnd"/>
+      <w:r>
+        <w:t xml:space="preserve"> lor de contact;</w:t>
       </w:r>
     </w:p>
     <w:p>
@@ -1501,8 +1710,77 @@
           <w:numId w:val="3"/>
         </w:numPr>
       </w:pPr>
-      <w:r>
-        <w:t>Evidenta dosarelor, cu clientul, avocatii responsabili, obiectul cauzel si stadiul current;</w:t>
+      <w:proofErr w:type="spellStart"/>
+      <w:r>
+        <w:t>Evidenta</w:t>
+      </w:r>
+      <w:proofErr w:type="spellEnd"/>
+      <w:r>
+        <w:t xml:space="preserve"> </w:t>
+      </w:r>
+      <w:proofErr w:type="spellStart"/>
+      <w:r>
+        <w:t>dosarelor</w:t>
+      </w:r>
+      <w:proofErr w:type="spellEnd"/>
+      <w:r>
+        <w:t xml:space="preserve">, cu </w:t>
+      </w:r>
+      <w:proofErr w:type="spellStart"/>
+      <w:r>
+        <w:t>clientul</w:t>
+      </w:r>
+      <w:proofErr w:type="spellEnd"/>
+      <w:r>
+        <w:t xml:space="preserve">, </w:t>
+      </w:r>
+      <w:proofErr w:type="spellStart"/>
+      <w:r>
+        <w:t>avocatii</w:t>
+      </w:r>
+      <w:proofErr w:type="spellEnd"/>
+      <w:r>
+        <w:t xml:space="preserve"> </w:t>
+      </w:r>
+      <w:proofErr w:type="spellStart"/>
+      <w:r>
+        <w:t>responsabili</w:t>
+      </w:r>
+      <w:proofErr w:type="spellEnd"/>
+      <w:r>
+        <w:t xml:space="preserve">, </w:t>
+      </w:r>
+      <w:proofErr w:type="spellStart"/>
+      <w:r>
+        <w:t>obiectul</w:t>
+      </w:r>
+      <w:proofErr w:type="spellEnd"/>
+      <w:r>
+        <w:t xml:space="preserve"> </w:t>
+      </w:r>
+      <w:proofErr w:type="spellStart"/>
+      <w:r>
+        <w:t>cauzel</w:t>
+      </w:r>
+      <w:proofErr w:type="spellEnd"/>
+      <w:r>
+        <w:t xml:space="preserve"> </w:t>
+      </w:r>
+      <w:proofErr w:type="spellStart"/>
+      <w:r>
+        <w:t>si</w:t>
+      </w:r>
+      <w:proofErr w:type="spellEnd"/>
+      <w:r>
+        <w:t xml:space="preserve"> </w:t>
+      </w:r>
+      <w:proofErr w:type="spellStart"/>
+      <w:r>
+        <w:t>stadiul</w:t>
+      </w:r>
+      <w:proofErr w:type="spellEnd"/>
+      <w:r>
+        <w:t xml:space="preserve"> current;</w:t>
       </w:r>
     </w:p>
     <w:p>
@@ -1513,8 +1791,69 @@
           <w:numId w:val="3"/>
         </w:numPr>
       </w:pPr>
-      <w:r>
-        <w:t>Gestiunea termenlor procedural si a intalnirilor, inclusive determinarea termenelor care se aproprie;</w:t>
+      <w:proofErr w:type="spellStart"/>
+      <w:r>
+        <w:t>Gestiunea</w:t>
+      </w:r>
+      <w:proofErr w:type="spellEnd"/>
+      <w:r>
+        <w:t xml:space="preserve"> </w:t>
+      </w:r>
+      <w:proofErr w:type="spellStart"/>
+      <w:r>
+        <w:t>termenlor</w:t>
+      </w:r>
+      <w:proofErr w:type="spellEnd"/>
+      <w:r>
+        <w:t xml:space="preserve"> procedural </w:t>
+      </w:r>
+      <w:proofErr w:type="spellStart"/>
+      <w:r>
+        <w:t>si</w:t>
+      </w:r>
+      <w:proofErr w:type="spellEnd"/>
+      <w:r>
+        <w:t xml:space="preserve"> </w:t>
+      </w:r>
+      <w:proofErr w:type="gramStart"/>
+      <w:r>
+        <w:t>a</w:t>
+      </w:r>
+      <w:proofErr w:type="gramEnd"/>
+      <w:r>
+        <w:t xml:space="preserve"> </w:t>
+      </w:r>
+      <w:proofErr w:type="spellStart"/>
+      <w:r>
+        <w:t>intalnirilor</w:t>
+      </w:r>
+      <w:proofErr w:type="spellEnd"/>
+      <w:r>
+        <w:t xml:space="preserve">, inclusive </w:t>
+      </w:r>
+      <w:proofErr w:type="spellStart"/>
+      <w:r>
+        <w:t>determinarea</w:t>
+      </w:r>
+      <w:proofErr w:type="spellEnd"/>
+      <w:r>
+        <w:t xml:space="preserve"> </w:t>
+      </w:r>
+      <w:proofErr w:type="spellStart"/>
+      <w:r>
+        <w:t>termenelor</w:t>
+      </w:r>
+      <w:proofErr w:type="spellEnd"/>
+      <w:r>
+        <w:t xml:space="preserve"> care se </w:t>
+      </w:r>
+      <w:proofErr w:type="spellStart"/>
+      <w:r>
+        <w:t>aproprie</w:t>
+      </w:r>
+      <w:proofErr w:type="spellEnd"/>
+      <w:r>
+        <w:t>;</w:t>
       </w:r>
     </w:p>
     <w:p>
@@ -1525,23 +1864,167 @@
           <w:numId w:val="3"/>
         </w:numPr>
       </w:pPr>
-      <w:r>
-        <w:t>Evidenta documentelor asociate fiecarui dosar;</w:t>
+      <w:proofErr w:type="spellStart"/>
+      <w:r>
+        <w:t>Evidenta</w:t>
+      </w:r>
+      <w:proofErr w:type="spellEnd"/>
+      <w:r>
+        <w:t xml:space="preserve"> </w:t>
+      </w:r>
+      <w:proofErr w:type="spellStart"/>
+      <w:r>
+        <w:t>documentelor</w:t>
+      </w:r>
+      <w:proofErr w:type="spellEnd"/>
+      <w:r>
+        <w:t xml:space="preserve"> </w:t>
+      </w:r>
+      <w:proofErr w:type="spellStart"/>
+      <w:r>
+        <w:t>asociate</w:t>
+      </w:r>
+      <w:proofErr w:type="spellEnd"/>
+      <w:r>
+        <w:t xml:space="preserve"> </w:t>
+      </w:r>
+      <w:proofErr w:type="spellStart"/>
+      <w:r>
+        <w:t>fiecarui</w:t>
+      </w:r>
+      <w:proofErr w:type="spellEnd"/>
+      <w:r>
+        <w:t xml:space="preserve"> </w:t>
+      </w:r>
+      <w:proofErr w:type="spellStart"/>
+      <w:r>
+        <w:t>dosar</w:t>
+      </w:r>
+      <w:proofErr w:type="spellEnd"/>
+      <w:r>
+        <w:t>;</w:t>
+      </w:r>
+    </w:p>
+    <w:p>
+      <w:pPr>
+        <w:pStyle w:val="ListParagraph"/>
+        <w:numPr>
+          <w:ilvl w:val="0"/>
+          <w:numId w:val="3"/>
+        </w:numPr>
+      </w:pPr>
+      <w:r>
+        <w:t xml:space="preserve">Modul </w:t>
+      </w:r>
+      <w:proofErr w:type="spellStart"/>
+      <w:r>
+        <w:t>dedicat</w:t>
+      </w:r>
+      <w:proofErr w:type="spellEnd"/>
+      <w:r>
+        <w:t xml:space="preserve"> </w:t>
+      </w:r>
+      <w:proofErr w:type="spellStart"/>
+      <w:r>
+        <w:t>pentru</w:t>
+      </w:r>
+      <w:proofErr w:type="spellEnd"/>
+      <w:r>
+        <w:t xml:space="preserve"> </w:t>
+      </w:r>
+      <w:proofErr w:type="spellStart"/>
+      <w:r>
+        <w:t>clienti</w:t>
+      </w:r>
+      <w:proofErr w:type="spellEnd"/>
+      <w:r>
+        <w:t>: acces securizat in aplicatie la fisa dosarelor proprii si la termenele de judecata asociate;</w:t>
+      </w:r>
+    </w:p>
+    <w:p>
+      <w:pPr>
+        <w:pStyle w:val="ListParagraph"/>
+        <w:numPr>
+          <w:ilvl w:val="0"/>
+          <w:numId w:val="3"/>
+        </w:numPr>
+      </w:pPr>
+      <w:proofErr w:type="spellStart"/>
+      <w:r>
+        <w:t>Depunerea</w:t>
+      </w:r>
+      <w:proofErr w:type="spellEnd"/>
+      <w:r>
+        <w:t xml:space="preserve"> </w:t>
+      </w:r>
+      <w:proofErr w:type="spellStart"/>
+      <w:r>
+        <w:t>si</w:t>
+      </w:r>
+      <w:proofErr w:type="spellEnd"/>
+      <w:r>
+        <w:t xml:space="preserve"> </w:t>
+      </w:r>
+      <w:proofErr w:type="spellStart"/>
+      <w:r>
+        <w:t>transmiterea</w:t>
+      </w:r>
+      <w:proofErr w:type="spellEnd"/>
+      <w:r>
+        <w:t xml:space="preserve"> </w:t>
+      </w:r>
+      <w:proofErr w:type="spellStart"/>
+      <w:r>
+        <w:t>documentelor</w:t>
+      </w:r>
+      <w:proofErr w:type="spellEnd"/>
+      <w:r>
+        <w:t xml:space="preserve"> </w:t>
+      </w:r>
+      <w:proofErr w:type="spellStart"/>
+      <w:r>
+        <w:t>ajutatoare</w:t>
+      </w:r>
+      <w:proofErr w:type="spellEnd"/>
+      <w:r>
+        <w:t xml:space="preserve"> </w:t>
+      </w:r>
+      <w:r>
+        <w:t xml:space="preserve">online de </w:t>
+      </w:r>
+      <w:proofErr w:type="spellStart"/>
+      <w:r>
+        <w:t>catre</w:t>
+      </w:r>
+      <w:proofErr w:type="spellEnd"/>
+      <w:r>
+        <w:t xml:space="preserve"> </w:t>
+      </w:r>
+      <w:proofErr w:type="spellStart"/>
+      <w:r>
+        <w:t>clienti</w:t>
+      </w:r>
+      <w:proofErr w:type="spellEnd"/>
+      <w:r>
+        <w:t xml:space="preserve"> direct in dosar, spre aprobarea avocatului.</w:t>
       </w:r>
     </w:p>
     <w:p>
       <w:pPr>
         <w:pStyle w:val="Heading2"/>
       </w:pPr>
-      <w:bookmarkStart w:id="6" w:name="_Toc243476265"/>
-      <w:r>
-        <w:t>2.2 Operatii</w:t>
+      <w:bookmarkStart w:id="6" w:name="_Toc244203033"/>
+      <w:proofErr w:type="spellStart"/>
+      <w:r>
+        <w:t>Operatii</w:t>
       </w:r>
       <w:bookmarkEnd w:id="6"/>
-    </w:p>
-    <w:p>
-      <w:pPr>
-        <w:pStyle w:val="NoSpacing"/>
+      <w:proofErr w:type="spellEnd"/>
+    </w:p>
+    <w:p>
+      <w:pPr>
+        <w:pStyle w:val="NoSpacing"/>
+        <w:spacing w:line="360" w:lineRule="auto"/>
       </w:pPr>
       <w:r>
         <w:tab/>
@@ -1551,6 +2034,7 @@
     <w:p>
       <w:pPr>
         <w:pStyle w:val="NoSpacing"/>
+        <w:spacing w:line="360" w:lineRule="auto"/>
         <w:ind w:firstLine="720"/>
       </w:pPr>
       <w:r>
@@ -1560,6 +2044,7 @@
     <w:p>
       <w:pPr>
         <w:pStyle w:val="NoSpacing"/>
+        <w:spacing w:line="360" w:lineRule="auto"/>
       </w:pPr>
       <w:r>
         <w:tab/>
@@ -1572,6 +2057,7 @@
     <w:p>
       <w:pPr>
         <w:pStyle w:val="NoSpacing"/>
+        <w:spacing w:line="360" w:lineRule="auto"/>
       </w:pPr>
       <w:r>
         <w:tab/>
@@ -1584,6 +2070,7 @@
     <w:p>
       <w:pPr>
         <w:pStyle w:val="NoSpacing"/>
+        <w:spacing w:line="360" w:lineRule="auto"/>
       </w:pPr>
       <w:r>
         <w:tab/>
@@ -1596,6 +2083,7 @@
     <w:p>
       <w:pPr>
         <w:pStyle w:val="NoSpacing"/>
+        <w:spacing w:line="360" w:lineRule="auto"/>
       </w:pPr>
       <w:r>
         <w:tab/>
@@ -1608,21 +2096,27 @@
     <w:p>
       <w:pPr>
         <w:pStyle w:val="NoSpacing"/>
-      </w:pPr>
-      <w:r>
-        <w:tab/>
-      </w:r>
-      <w:r>
-        <w:tab/>
-        <w:t>-</w:t>
-      </w:r>
-      <w:r>
-        <w:t>Emiterea facturilor si inregistrarea incasarilor</w:t>
-      </w:r>
-    </w:p>
-    <w:p>
-      <w:pPr>
-        <w:pStyle w:val="NoSpacing"/>
+        <w:spacing w:line="360" w:lineRule="auto"/>
+        <w:ind w:left="720" w:firstLine="720"/>
+      </w:pPr>
+      <w:r>
+        <w:t>-Incarcarea documentelor in dosar de catre clienti sau avocati direct din aplicatie;</w:t>
+      </w:r>
+    </w:p>
+    <w:p>
+      <w:pPr>
+        <w:pStyle w:val="NoSpacing"/>
+        <w:spacing w:line="360" w:lineRule="auto"/>
+        <w:ind w:left="720" w:firstLine="720"/>
+      </w:pPr>
+      <w:r>
+        <w:t>-Emiterea facturilor si inregistrarea platilor (integrale sau in rate)</w:t>
+      </w:r>
+    </w:p>
+    <w:p>
+      <w:pPr>
+        <w:pStyle w:val="NoSpacing"/>
+        <w:spacing w:line="360" w:lineRule="auto"/>
       </w:pPr>
       <w:r>
         <w:tab/>
@@ -1632,6 +2126,7 @@
     <w:p>
       <w:pPr>
         <w:pStyle w:val="NoSpacing"/>
+        <w:spacing w:line="360" w:lineRule="auto"/>
       </w:pPr>
       <w:r>
         <w:tab/>
@@ -1644,6 +2139,7 @@
     <w:p>
       <w:pPr>
         <w:pStyle w:val="NoSpacing"/>
+        <w:spacing w:line="360" w:lineRule="auto"/>
       </w:pPr>
       <w:r>
         <w:tab/>
@@ -1656,6 +2152,7 @@
     <w:p>
       <w:pPr>
         <w:pStyle w:val="NoSpacing"/>
+        <w:spacing w:line="360" w:lineRule="auto"/>
       </w:pPr>
       <w:r>
         <w:tab/>
@@ -1668,6 +2165,18 @@
     <w:p>
       <w:pPr>
         <w:pStyle w:val="NoSpacing"/>
+        <w:spacing w:line="360" w:lineRule="auto"/>
+        <w:ind w:left="720" w:firstLine="720"/>
+      </w:pPr>
+      <w:r>
+        <w:lastRenderedPageBreak/>
+        <w:t>-Consultarea dosarelor proprii si a termenelor active de catre clienti prin autentificare in aplicatie;</w:t>
+      </w:r>
+    </w:p>
+    <w:p>
+      <w:pPr>
+        <w:pStyle w:val="NoSpacing"/>
+        <w:spacing w:line="360" w:lineRule="auto"/>
       </w:pPr>
       <w:r>
         <w:tab/>
@@ -1677,6 +2186,7 @@
     <w:p>
       <w:pPr>
         <w:pStyle w:val="NoSpacing"/>
+        <w:spacing w:line="360" w:lineRule="auto"/>
       </w:pPr>
       <w:r>
         <w:tab/>
@@ -1689,6 +2199,7 @@
     <w:p>
       <w:pPr>
         <w:pStyle w:val="NoSpacing"/>
+        <w:spacing w:line="360" w:lineRule="auto"/>
       </w:pPr>
       <w:r>
         <w:tab/>
@@ -1701,6 +2212,7 @@
     <w:p>
       <w:pPr>
         <w:pStyle w:val="NoSpacing"/>
+        <w:spacing w:line="360" w:lineRule="auto"/>
       </w:pPr>
       <w:r>
         <w:tab/>
@@ -1713,18 +2225,17 @@
     <w:p>
       <w:pPr>
         <w:pStyle w:val="NoSpacing"/>
-      </w:pPr>
-      <w:r>
-        <w:tab/>
-      </w:r>
-      <w:r>
-        <w:tab/>
-        <w:t>-Schimbarea starii facturii la incasare;</w:t>
-      </w:r>
-    </w:p>
-    <w:p>
-      <w:pPr>
-        <w:pStyle w:val="NoSpacing"/>
+        <w:spacing w:line="360" w:lineRule="auto"/>
+        <w:ind w:left="720" w:firstLine="720"/>
+      </w:pPr>
+      <w:r>
+        <w:t>-Schimbarea starii facturii la inregistrarea platii;</w:t>
+      </w:r>
+    </w:p>
+    <w:p>
+      <w:pPr>
+        <w:pStyle w:val="NoSpacing"/>
+        <w:spacing w:line="360" w:lineRule="auto"/>
       </w:pPr>
       <w:r>
         <w:tab/>
@@ -1734,6 +2245,7 @@
     <w:p>
       <w:pPr>
         <w:pStyle w:val="NoSpacing"/>
+        <w:spacing w:line="360" w:lineRule="auto"/>
       </w:pPr>
       <w:r>
         <w:tab/>
@@ -1746,6 +2258,7 @@
     <w:p>
       <w:pPr>
         <w:pStyle w:val="NoSpacing"/>
+        <w:spacing w:line="360" w:lineRule="auto"/>
       </w:pPr>
       <w:r>
         <w:tab/>
@@ -1758,6 +2271,7 @@
     <w:p>
       <w:pPr>
         <w:pStyle w:val="NoSpacing"/>
+        <w:spacing w:line="360" w:lineRule="auto"/>
       </w:pPr>
       <w:r>
         <w:tab/>
@@ -1774,67 +2288,88 @@
       <w:pPr>
         <w:pStyle w:val="Heading2"/>
       </w:pPr>
-      <w:bookmarkStart w:id="7" w:name="_Toc243476266"/>
+      <w:bookmarkStart w:id="7" w:name="_Toc244203034"/>
+      <w:proofErr w:type="spellStart"/>
+      <w:r>
+        <w:t>Utilizatori</w:t>
+      </w:r>
+      <w:bookmarkEnd w:id="7"/>
+      <w:proofErr w:type="spellEnd"/>
+    </w:p>
+    <w:p>
+      <w:r>
+        <w:tab/>
+        <w:t>JuriDesk este desinat personalului unui cabinet de avocatura, iar accesul la date difera in functie de rolul fiecarui utilizator. In aceasta situatie sunt luate in calcul 3 tipuri diferite de utilizatori:</w:t>
+      </w:r>
+    </w:p>
+    <w:p>
+      <w:pPr>
+        <w:ind w:left="720"/>
+      </w:pPr>
+      <w:r>
+        <w:t>-Avocatul titular: conduce cabinetul si raspunde de activitatea acestuia. El va avea acces complet la dosare, clienti, termene si gestionarea utilizatorilor.</w:t>
+      </w:r>
+    </w:p>
+    <w:p>
+      <w:pPr>
+        <w:ind w:left="720"/>
+      </w:pPr>
+      <w:r>
+        <w:t>-Avocat colaborator: lucreaza la dosarele care ii sunt repartizate. Poate consulta si actualiza dosarele proprii, termenele si activitatile.</w:t>
+      </w:r>
+    </w:p>
+    <w:p>
+      <w:pPr>
+        <w:ind w:left="720"/>
+      </w:pPr>
+      <w:r>
+        <w:t xml:space="preserve">-Personal administrativ: asigura secretariatul si evidenta financiara. Inregistreaza clienti, termene si documente, emite facturi si inregistreaza incasari. </w:t>
+      </w:r>
+    </w:p>
+    <w:p>
+      <w:pPr>
+        <w:ind w:firstLine="720"/>
+      </w:pPr>
+      <w:r>
+        <w:t xml:space="preserve">-Client: persoana fizica sau reprezentantul legal al persoanei juridice asistate. Se autentifica in aplicatie si are o interfata simplificata, prin care isi </w:t>
+      </w:r>
+      <w:r>
+        <w:t xml:space="preserve">vede doar </w:t>
+      </w:r>
+      <w:r>
+        <w:t>propriile dosare, urmareste termenele stabilite si poate incarca documente probatorii direct in fisa cauzei.</w:t>
+      </w:r>
+    </w:p>
+    <w:p>
+      <w:pPr>
+        <w:pStyle w:val="TOC1"/>
+      </w:pPr>
+    </w:p>
+    <w:p>
+      <w:r>
+        <w:br w:type="page"/>
+      </w:r>
+    </w:p>
+    <w:p>
+      <w:pPr>
+        <w:pStyle w:val="Heading1"/>
+      </w:pPr>
+      <w:bookmarkStart w:id="8" w:name="_Toc244203035"/>
       <w:r>
         <w:lastRenderedPageBreak/>
-        <w:t>2.3 Utilizatori</w:t>
-      </w:r>
-      <w:bookmarkEnd w:id="7"/>
-    </w:p>
-    <w:p>
-      <w:r>
-        <w:tab/>
-        <w:t>JuriDesk este desinat personalului unui cabinet de avocatura, iar accesul la date difera in functie de rolul fiecarui utilizator. In aceasta situatie sunt luate in calcul 3 tipuri diferite de utilizatori:</w:t>
-      </w:r>
-    </w:p>
-    <w:p>
-      <w:pPr>
-        <w:ind w:left="720"/>
-      </w:pPr>
-      <w:r>
-        <w:t>-Avocatul titular: conduce cabinetul si raspunde de activitatea acestuia. El va avea acces complet la dosare, clienti, termene si gestionarea utilizatorilor.</w:t>
-      </w:r>
-    </w:p>
-    <w:p>
-      <w:pPr>
-        <w:ind w:left="720"/>
-      </w:pPr>
-      <w:r>
-        <w:t>-Avocat colaborator: lucreaza la dosarele care ii sunt repartizate. Poate consulta si actualiza dosarele proprii, termenele si activitatile.</w:t>
-      </w:r>
-    </w:p>
-    <w:p>
-      <w:pPr>
-        <w:ind w:left="720"/>
-      </w:pPr>
-      <w:r>
-        <w:t xml:space="preserve">-Personal administrativ: asigura secretariatul si evidenta financiara. Inregistreaza clienti, termene si documente, emite facturi si inregistreaza incasari. </w:t>
-      </w:r>
-    </w:p>
-    <w:p>
-      <w:pPr>
-        <w:pStyle w:val="TOC1"/>
-      </w:pPr>
-    </w:p>
-    <w:p>
-      <w:r>
-        <w:br w:type="page"/>
-      </w:r>
-    </w:p>
-    <w:p>
-      <w:pPr>
-        <w:pStyle w:val="Heading1"/>
-      </w:pPr>
-      <w:bookmarkStart w:id="8" w:name="_Toc243476267"/>
-      <w:r>
-        <w:lastRenderedPageBreak/>
-        <w:t>3. Proiectare</w:t>
+        <w:t xml:space="preserve">3. </w:t>
+      </w:r>
+      <w:proofErr w:type="spellStart"/>
+      <w:r>
+        <w:t>Proiectare</w:t>
       </w:r>
       <w:bookmarkEnd w:id="8"/>
-    </w:p>
-    <w:p>
-      <w:pPr>
-        <w:pStyle w:val="NoSpacing"/>
+      <w:proofErr w:type="spellEnd"/>
+    </w:p>
+    <w:p>
+      <w:pPr>
+        <w:pStyle w:val="NoSpacing"/>
+        <w:spacing w:line="360" w:lineRule="auto"/>
       </w:pPr>
       <w:r>
         <w:tab/>
@@ -1845,15 +2380,21 @@
       <w:pPr>
         <w:pStyle w:val="Heading2"/>
       </w:pPr>
-      <w:bookmarkStart w:id="9" w:name="_Toc243476268"/>
-      <w:r>
-        <w:t>3.1 Analiza cerintelor</w:t>
+      <w:bookmarkStart w:id="9" w:name="_Toc244203036"/>
+      <w:r>
+        <w:t xml:space="preserve">Analiza </w:t>
+      </w:r>
+      <w:proofErr w:type="spellStart"/>
+      <w:r>
+        <w:t>cerintelor</w:t>
       </w:r>
       <w:bookmarkEnd w:id="9"/>
-    </w:p>
-    <w:p>
-      <w:pPr>
-        <w:pStyle w:val="NoSpacing"/>
+      <w:proofErr w:type="spellEnd"/>
+    </w:p>
+    <w:p>
+      <w:pPr>
+        <w:pStyle w:val="NoSpacing"/>
+        <w:spacing w:line="360" w:lineRule="auto"/>
       </w:pPr>
       <w:r>
         <w:tab/>
@@ -1872,18 +2413,35 @@
           <w:color w:val="000000" w:themeColor="text1"/>
         </w:rPr>
       </w:pPr>
-      <w:bookmarkStart w:id="10" w:name="_Toc243476269"/>
+      <w:bookmarkStart w:id="10" w:name="_Toc244203037"/>
+      <w:proofErr w:type="spellStart"/>
       <w:r>
         <w:rPr>
           <w:color w:val="000000" w:themeColor="text1"/>
         </w:rPr>
-        <w:t>3.1.1 Actorii sistemului</w:t>
+        <w:t>Actorii</w:t>
+      </w:r>
+      <w:proofErr w:type="spellEnd"/>
+      <w:r>
+        <w:rPr>
+          <w:color w:val="000000" w:themeColor="text1"/>
+        </w:rPr>
+        <w:t xml:space="preserve"> </w:t>
+      </w:r>
+      <w:proofErr w:type="spellStart"/>
+      <w:r>
+        <w:rPr>
+          <w:color w:val="000000" w:themeColor="text1"/>
+        </w:rPr>
+        <w:t>sistemului</w:t>
       </w:r>
       <w:bookmarkEnd w:id="10"/>
-    </w:p>
-    <w:p>
-      <w:pPr>
-        <w:pStyle w:val="NoSpacing"/>
+      <w:proofErr w:type="spellEnd"/>
+    </w:p>
+    <w:p>
+      <w:pPr>
+        <w:pStyle w:val="NoSpacing"/>
+        <w:spacing w:line="360" w:lineRule="auto"/>
       </w:pPr>
       <w:r>
         <w:tab/>
@@ -1895,6 +2453,7 @@
     <w:p>
       <w:pPr>
         <w:pStyle w:val="NoSpacing"/>
+        <w:spacing w:line="360" w:lineRule="auto"/>
       </w:pPr>
       <w:r>
         <w:tab/>
@@ -1904,6 +2463,7 @@
     <w:p>
       <w:pPr>
         <w:pStyle w:val="NoSpacing"/>
+        <w:spacing w:line="360" w:lineRule="auto"/>
       </w:pPr>
       <w:r>
         <w:tab/>
@@ -1913,6 +2473,23 @@
     <w:p>
       <w:pPr>
         <w:pStyle w:val="NoSpacing"/>
+        <w:spacing w:line="360" w:lineRule="auto"/>
+        <w:ind w:firstLine="720"/>
+      </w:pPr>
+      <w:r>
+        <w:t xml:space="preserve">Client: se autentifica in aplicatie cu rol de client. Are drepturi </w:t>
+      </w:r>
+      <w:r>
+        <w:t>scazute</w:t>
+      </w:r>
+      <w:r>
+        <w:t>: poate consulta dosarele unde este titular, vede termenele asociate si poate incarca documente probatorii.</w:t>
+      </w:r>
+    </w:p>
+    <w:p>
+      <w:pPr>
+        <w:pStyle w:val="NoSpacing"/>
+        <w:spacing w:line="360" w:lineRule="auto"/>
       </w:pPr>
     </w:p>
     <w:p>
@@ -1922,39 +2499,73 @@
           <w:color w:val="000000" w:themeColor="text1"/>
         </w:rPr>
       </w:pPr>
-      <w:bookmarkStart w:id="11" w:name="_Toc243476270"/>
+      <w:bookmarkStart w:id="11" w:name="_Toc244203038"/>
+      <w:proofErr w:type="spellStart"/>
       <w:r>
         <w:rPr>
           <w:color w:val="000000" w:themeColor="text1"/>
         </w:rPr>
-        <w:t>3.1.2 Cerinte functionale</w:t>
+        <w:t>Cerinte</w:t>
+      </w:r>
+      <w:proofErr w:type="spellEnd"/>
+      <w:r>
+        <w:rPr>
+          <w:color w:val="000000" w:themeColor="text1"/>
+        </w:rPr>
+        <w:t xml:space="preserve"> </w:t>
+      </w:r>
+      <w:proofErr w:type="spellStart"/>
+      <w:r>
+        <w:rPr>
+          <w:color w:val="000000" w:themeColor="text1"/>
+        </w:rPr>
+        <w:t>functionale</w:t>
       </w:r>
       <w:bookmarkEnd w:id="11"/>
-    </w:p>
-    <w:p>
-      <w:pPr>
-        <w:pStyle w:val="NoSpacing"/>
-      </w:pPr>
-      <w:r>
-        <w:tab/>
+      <w:proofErr w:type="spellEnd"/>
+    </w:p>
+    <w:p>
+      <w:pPr>
+        <w:pStyle w:val="NoSpacing"/>
+        <w:spacing w:line="360" w:lineRule="auto"/>
+      </w:pPr>
+      <w:r>
+        <w:tab/>
+      </w:r>
+      <w:r>
+        <w:t>fr</w:t>
+      </w:r>
+      <w:r>
         <w:t>1. Gestiunea securitatii si autentificarii: sistemul permite autentificarea unica pe baza de email si parola prin functia de hash, dar verfica starea contului inainte de a acorda acces.</w:t>
       </w:r>
     </w:p>
     <w:p>
       <w:pPr>
         <w:pStyle w:val="NoSpacing"/>
-      </w:pPr>
-      <w:r>
-        <w:tab/>
+        <w:spacing w:line="360" w:lineRule="auto"/>
+      </w:pPr>
+      <w:r>
+        <w:tab/>
+      </w:r>
+      <w:r>
+        <w:t>fr</w:t>
+      </w:r>
+      <w:r>
         <w:t>2. Administrarea clientilor: crearea si actualizarea fiselor de clienti, validarea unicitatii si asocierea mai multor metode de contact.</w:t>
       </w:r>
     </w:p>
     <w:p>
       <w:pPr>
         <w:pStyle w:val="NoSpacing"/>
-      </w:pPr>
-      <w:r>
-        <w:tab/>
+        <w:spacing w:line="360" w:lineRule="auto"/>
+      </w:pPr>
+      <w:r>
+        <w:tab/>
+      </w:r>
+      <w:r>
+        <w:t>fr</w:t>
+      </w:r>
+      <w:r>
         <w:t>3. Administrarea dosarelor si alocarea resurselor: inregistreaza numarul unic de dosar, stabileste obiectivul, instanta si faza procedurala si apoi poate asocia un colectiv de avocati</w:t>
       </w:r>
       <w:r>
@@ -1964,18 +2575,30 @@
     <w:p>
       <w:pPr>
         <w:pStyle w:val="NoSpacing"/>
-      </w:pPr>
-      <w:r>
-        <w:tab/>
+        <w:spacing w:line="360" w:lineRule="auto"/>
+      </w:pPr>
+      <w:r>
+        <w:tab/>
+      </w:r>
+      <w:r>
+        <w:t>fr</w:t>
+      </w:r>
+      <w:r>
         <w:t>4. Agenda si termene procedurale: programarea termenelor de judecata si a intalnirilor cu clienti si marcarea starii curente a termenului.</w:t>
       </w:r>
     </w:p>
     <w:p>
       <w:pPr>
         <w:pStyle w:val="NoSpacing"/>
-      </w:pPr>
-      <w:r>
-        <w:tab/>
+        <w:spacing w:line="360" w:lineRule="auto"/>
+      </w:pPr>
+      <w:r>
+        <w:tab/>
+      </w:r>
+      <w:r>
+        <w:t>fr</w:t>
+      </w:r>
+      <w:r>
         <w:t>5. Registratura electronica a documentelor:</w:t>
       </w:r>
       <w:r>
@@ -1988,15 +2611,34 @@
     <w:p>
       <w:pPr>
         <w:pStyle w:val="NoSpacing"/>
-      </w:pPr>
-      <w:r>
-        <w:tab/>
+        <w:spacing w:line="360" w:lineRule="auto"/>
+      </w:pPr>
+      <w:r>
+        <w:tab/>
+      </w:r>
+      <w:r>
+        <w:t>fr</w:t>
+      </w:r>
+      <w:r>
         <w:t>6. Evidenta financiara: generarea automata a facturilor pe baza dosarului si inregistrarea platilor in rate sau integral.</w:t>
       </w:r>
     </w:p>
     <w:p>
       <w:pPr>
         <w:pStyle w:val="NoSpacing"/>
+        <w:spacing w:line="360" w:lineRule="auto"/>
+        <w:ind w:firstLine="720"/>
+      </w:pPr>
+      <w:r>
+        <w:lastRenderedPageBreak/>
+        <w:t>fr7. Autentificarea si accesul clientilor: aplicatia permite crearea de conturi de utilizator cu rolul de 'client'. Dupa autentificare, clientul acceseaza modulul de vizualizare a dosarelor proprii si poate incarca documente relevante, acestea fiind marcate cu identitatea clientului si data incarcarii.</w:t>
+      </w:r>
+    </w:p>
+    <w:p>
+      <w:pPr>
+        <w:pStyle w:val="NoSpacing"/>
+        <w:spacing w:line="360" w:lineRule="auto"/>
+        <w:ind w:firstLine="720"/>
       </w:pPr>
     </w:p>
     <w:p>
@@ -2006,39 +2648,73 @@
           <w:color w:val="000000" w:themeColor="text1"/>
         </w:rPr>
       </w:pPr>
-      <w:bookmarkStart w:id="12" w:name="_Toc243476271"/>
+      <w:bookmarkStart w:id="12" w:name="_Toc244203039"/>
+      <w:proofErr w:type="spellStart"/>
       <w:r>
         <w:rPr>
           <w:color w:val="000000" w:themeColor="text1"/>
         </w:rPr>
-        <w:t>3.1.3 Cerinte non-functionale</w:t>
+        <w:t>Cerinte</w:t>
+      </w:r>
+      <w:proofErr w:type="spellEnd"/>
+      <w:r>
+        <w:rPr>
+          <w:color w:val="000000" w:themeColor="text1"/>
+        </w:rPr>
+        <w:t xml:space="preserve"> non-</w:t>
+      </w:r>
+      <w:proofErr w:type="spellStart"/>
+      <w:r>
+        <w:rPr>
+          <w:color w:val="000000" w:themeColor="text1"/>
+        </w:rPr>
+        <w:t>functionale</w:t>
       </w:r>
       <w:bookmarkEnd w:id="12"/>
-    </w:p>
-    <w:p>
-      <w:pPr>
-        <w:pStyle w:val="NoSpacing"/>
-      </w:pPr>
-      <w:r>
-        <w:tab/>
+      <w:proofErr w:type="spellEnd"/>
+    </w:p>
+    <w:p>
+      <w:pPr>
+        <w:pStyle w:val="NoSpacing"/>
+        <w:spacing w:line="360" w:lineRule="auto"/>
+      </w:pPr>
+      <w:r>
+        <w:tab/>
+      </w:r>
+      <w:r>
+        <w:t>nfr</w:t>
+      </w:r>
+      <w:r>
         <w:t>1. Securitate: parolele nu sunt stocate crud, si sunt bagata intr-un hash.</w:t>
       </w:r>
     </w:p>
     <w:p>
       <w:pPr>
         <w:pStyle w:val="NoSpacing"/>
-      </w:pPr>
-      <w:r>
-        <w:tab/>
+        <w:spacing w:line="360" w:lineRule="auto"/>
+      </w:pPr>
+      <w:r>
+        <w:tab/>
+      </w:r>
+      <w:r>
+        <w:t>nfr</w:t>
+      </w:r>
+      <w:r>
         <w:t>2. Integritate si consistenta: aplicarea constrangerilor de integritate si utilizarea constrangerilor de unicitate.</w:t>
       </w:r>
     </w:p>
     <w:p>
       <w:pPr>
         <w:pStyle w:val="NoSpacing"/>
-      </w:pPr>
-      <w:r>
-        <w:tab/>
+        <w:spacing w:line="360" w:lineRule="auto"/>
+      </w:pPr>
+      <w:r>
+        <w:tab/>
+      </w:r>
+      <w:r>
+        <w:t>nfr</w:t>
+      </w:r>
+      <w:r>
         <w:t>3. Performanta: optimizarea timpilor de cautare prin indexi.</w:t>
       </w:r>
     </w:p>
@@ -2046,18 +2722,43 @@
       <w:pPr>
         <w:pStyle w:val="Heading2"/>
       </w:pPr>
-      <w:bookmarkStart w:id="13" w:name="_Toc243476272"/>
-      <w:r>
-        <w:t>3.2 Model ER</w:t>
+      <w:bookmarkStart w:id="13" w:name="_Toc244203040"/>
+      <w:proofErr w:type="spellStart"/>
+      <w:r>
+        <w:t>Descriere</w:t>
       </w:r>
       <w:bookmarkEnd w:id="13"/>
-      <w:r>
-        <w:tab/>
-      </w:r>
-    </w:p>
-    <w:p>
-      <w:pPr>
-        <w:pStyle w:val="NoSpacing"/>
+      <w:proofErr w:type="spellEnd"/>
+      <w:r>
+        <w:t xml:space="preserve"> </w:t>
+      </w:r>
+    </w:p>
+    <w:p>
+      <w:pPr>
+        <w:pStyle w:val="NoSpacing"/>
+        <w:spacing w:line="360" w:lineRule="auto"/>
+      </w:pPr>
+      <w:r>
+        <w:t>Totul incepe de la un client, care are una sau mai multe metode de contact (telefon, email etc.). Clientul poate avea unul sau mai multe dosare preluate de cabinet. Fiecare dosar este judecat la o instanta competenta. Pe parcursul solutionarii cauzei se stabilesc termene procedurale, se desfasoara intalniri de lucru sau consultatii si se ataseaza documente probatorii. De gestionarea unui dosar se ocupa unul sau mai multi avocati, iar un avocat poate instrumenta simultan mai multe dosare. Toti utilizatorii aplicatiei (avocati titulari, avocati colaboratori, secretari si clienti) detin un cont unic in entitatea UTILIZATOR, avand drepturi diferentiate prin atributul 'rol'. Astfel, clientul se poate autentifica in aplicatie pentru a-si consulta dosarul si pentru a incarca documente utile. Pentru fiecare dosar se emit facturi, iar plata onorariilor se poate efectua integral sau esalonat in rate.</w:t>
+      </w:r>
+    </w:p>
+    <w:p>
+      <w:pPr>
+        <w:pStyle w:val="Heading2"/>
+      </w:pPr>
+      <w:bookmarkStart w:id="14" w:name="_Toc244203041"/>
+      <w:r>
+        <w:t>Model ER</w:t>
+      </w:r>
+      <w:bookmarkEnd w:id="14"/>
+      <w:r>
+        <w:tab/>
+      </w:r>
+    </w:p>
+    <w:p>
+      <w:pPr>
+        <w:pStyle w:val="NoSpacing"/>
+        <w:spacing w:line="360" w:lineRule="auto"/>
       </w:pPr>
       <w:r>
         <w:tab/>
@@ -2069,14 +2770,14 @@
     <w:p>
       <w:pPr>
         <w:pStyle w:val="NoSpacing"/>
-      </w:pPr>
-      <w:r>
-        <w:lastRenderedPageBreak/>
+        <w:spacing w:line="360" w:lineRule="auto"/>
+      </w:pPr>
+      <w:r>
         <w:drawing>
-          <wp:inline distT="0" distB="0" distL="0" distR="0" wp14:anchorId="1A3913E9" wp14:editId="6D969736">
-            <wp:extent cx="5760720" cy="3244215"/>
+          <wp:inline distT="0" distB="0" distL="0" distR="0" wp14:anchorId="2BA5DEC2" wp14:editId="573C3FAC">
+            <wp:extent cx="5760720" cy="2159635"/>
             <wp:effectExtent l="0" t="0" r="0" b="0"/>
-            <wp:docPr id="1584556839" name="Picture 1"/>
+            <wp:docPr id="1490830334" name="Picture 1"/>
             <wp:cNvGraphicFramePr>
               <a:graphicFrameLocks xmlns:a="http://schemas.openxmlformats.org/drawingml/2006/main" noChangeAspect="1"/>
             </wp:cNvGraphicFramePr>
@@ -2084,7 +2785,7 @@
               <a:graphicData uri="http://schemas.openxmlformats.org/drawingml/2006/picture">
                 <pic:pic xmlns:pic="http://schemas.openxmlformats.org/drawingml/2006/picture">
                   <pic:nvPicPr>
-                    <pic:cNvPr id="1584556839" name=""/>
+                    <pic:cNvPr id="1490830334" name=""/>
                     <pic:cNvPicPr/>
                   </pic:nvPicPr>
                   <pic:blipFill>
@@ -2096,7 +2797,7 @@
                   <pic:spPr>
                     <a:xfrm>
                       <a:off x="0" y="0"/>
-                      <a:ext cx="5760720" cy="3244215"/>
+                      <a:ext cx="5760720" cy="2159635"/>
                     </a:xfrm>
                     <a:prstGeom prst="rect">
                       <a:avLst/>
@@ -2111,11 +2812,22 @@
     </w:p>
     <w:p>
       <w:pPr>
+        <w:pStyle w:val="NoSpacing"/>
+        <w:spacing w:line="360" w:lineRule="auto"/>
+      </w:pPr>
+    </w:p>
+    <w:p>
+      <w:pPr>
         <w:pStyle w:val="ListParagraph"/>
         <w:jc w:val="center"/>
       </w:pPr>
-      <w:r>
-        <w:t xml:space="preserve">Figura </w:t>
+      <w:proofErr w:type="spellStart"/>
+      <w:r>
+        <w:t>Figura</w:t>
+      </w:r>
+      <w:proofErr w:type="spellEnd"/>
+      <w:r>
+        <w:t xml:space="preserve"> </w:t>
       </w:r>
       <w:r>
         <w:t>3.</w:t>
@@ -2124,8 +2836,37 @@
         <w:t>1</w:t>
       </w:r>
       <w:r>
-        <w:t xml:space="preserve"> Diagrama ER a aplicatiei JuriDesk</w:t>
-      </w:r>
+        <w:t xml:space="preserve"> </w:t>
+      </w:r>
+      <w:proofErr w:type="spellStart"/>
+      <w:r>
+        <w:t>Diagrama</w:t>
+      </w:r>
+      <w:proofErr w:type="spellEnd"/>
+      <w:r>
+        <w:t xml:space="preserve"> ER </w:t>
+      </w:r>
+      <w:proofErr w:type="gramStart"/>
+      <w:r>
+        <w:t>a</w:t>
+      </w:r>
+      <w:proofErr w:type="gramEnd"/>
+      <w:r>
+        <w:t xml:space="preserve"> </w:t>
+      </w:r>
+      <w:proofErr w:type="spellStart"/>
+      <w:r>
+        <w:t>aplicatiei</w:t>
+      </w:r>
+      <w:proofErr w:type="spellEnd"/>
+      <w:r>
+        <w:t xml:space="preserve"> </w:t>
+      </w:r>
+      <w:proofErr w:type="spellStart"/>
+      <w:r>
+        <w:t>JuriDesk</w:t>
+      </w:r>
+      <w:proofErr w:type="spellEnd"/>
     </w:p>
     <w:p>
       <w:pPr>
@@ -2135,104 +2876,417 @@
     </w:p>
     <w:p>
       <w:pPr>
-        <w:pStyle w:val="ListParagraph"/>
-        <w:jc w:val="center"/>
-      </w:pPr>
-      <w:r>
-        <w:rPr>
-          <w:noProof/>
-        </w:rPr>
-        <w:drawing>
-          <wp:inline distT="0" distB="0" distL="0" distR="0" wp14:anchorId="7AC0FFA6" wp14:editId="2A91B04D">
-            <wp:extent cx="5760720" cy="3961765"/>
-            <wp:effectExtent l="0" t="0" r="0" b="635"/>
-            <wp:docPr id="1664252697" name="Picture 1"/>
-            <wp:cNvGraphicFramePr>
-              <a:graphicFrameLocks xmlns:a="http://schemas.openxmlformats.org/drawingml/2006/main" noChangeAspect="1"/>
-            </wp:cNvGraphicFramePr>
-            <a:graphic xmlns:a="http://schemas.openxmlformats.org/drawingml/2006/main">
-              <a:graphicData uri="http://schemas.openxmlformats.org/drawingml/2006/picture">
-                <pic:pic xmlns:pic="http://schemas.openxmlformats.org/drawingml/2006/picture">
-                  <pic:nvPicPr>
-                    <pic:cNvPr id="1664252697" name=""/>
-                    <pic:cNvPicPr/>
-                  </pic:nvPicPr>
-                  <pic:blipFill>
-                    <a:blip r:embed="rId9"/>
-                    <a:stretch>
-                      <a:fillRect/>
-                    </a:stretch>
-                  </pic:blipFill>
-                  <pic:spPr>
-                    <a:xfrm>
-                      <a:off x="0" y="0"/>
-                      <a:ext cx="5760720" cy="3961765"/>
-                    </a:xfrm>
-                    <a:prstGeom prst="rect">
-                      <a:avLst/>
-                    </a:prstGeom>
-                  </pic:spPr>
-                </pic:pic>
-              </a:graphicData>
-            </a:graphic>
-          </wp:inline>
-        </w:drawing>
-      </w:r>
-    </w:p>
-    <w:p>
-      <w:pPr>
-        <w:pStyle w:val="ListParagraph"/>
-        <w:jc w:val="center"/>
-      </w:pPr>
-      <w:r>
-        <w:t>Figura 3.2 Diagrama a bazei de date JuriDesk</w:t>
-      </w:r>
-    </w:p>
-    <w:p>
-      <w:pPr>
-        <w:pStyle w:val="Heading3"/>
-        <w:rPr>
-          <w:color w:val="auto"/>
-        </w:rPr>
-      </w:pPr>
-      <w:r>
-        <w:rPr>
-          <w:color w:val="auto"/>
-        </w:rPr>
-        <w:t xml:space="preserve">3.2.1 </w:t>
-      </w:r>
-      <w:r>
-        <w:rPr>
-          <w:color w:val="auto"/>
-        </w:rPr>
-        <w:t>Descrierea entitatilor si a atributelor</w:t>
-      </w:r>
-    </w:p>
-    <w:p>
-      <w:pPr>
-        <w:pStyle w:val="NoSpacing"/>
-      </w:pPr>
-      <w:r>
-        <w:t>Modelul conceptual include 11 entitati proiectate pentru a curpinde fluxul juridic, administrativ si cel financiar.</w:t>
-      </w:r>
-    </w:p>
-    <w:p>
-      <w:pPr>
-        <w:pStyle w:val="NoSpacing"/>
-      </w:pPr>
-    </w:p>
-    <w:p>
-      <w:pPr>
-        <w:pStyle w:val="NoSpacing"/>
+        <w:pStyle w:val="Heading2"/>
+      </w:pPr>
+      <w:bookmarkStart w:id="15" w:name="_Toc244203042"/>
+      <w:proofErr w:type="spellStart"/>
+      <w:r>
+        <w:t>Descrierea</w:t>
+      </w:r>
+      <w:proofErr w:type="spellEnd"/>
+      <w:r>
+        <w:t xml:space="preserve"> </w:t>
+      </w:r>
+      <w:proofErr w:type="spellStart"/>
+      <w:r>
+        <w:t>entitatilor</w:t>
+      </w:r>
+      <w:proofErr w:type="spellEnd"/>
+      <w:r>
+        <w:t xml:space="preserve"> </w:t>
+      </w:r>
+      <w:proofErr w:type="spellStart"/>
+      <w:r>
+        <w:t>si</w:t>
+      </w:r>
+      <w:proofErr w:type="spellEnd"/>
+      <w:r>
+        <w:t xml:space="preserve"> </w:t>
+      </w:r>
+      <w:proofErr w:type="gramStart"/>
+      <w:r>
+        <w:t>a</w:t>
+      </w:r>
+      <w:proofErr w:type="gramEnd"/>
+      <w:r>
+        <w:t xml:space="preserve"> </w:t>
+      </w:r>
+      <w:proofErr w:type="spellStart"/>
+      <w:r>
+        <w:t>atributelor</w:t>
+      </w:r>
+      <w:bookmarkEnd w:id="15"/>
+      <w:proofErr w:type="spellEnd"/>
+    </w:p>
+    <w:p>
+      <w:pPr>
+        <w:pStyle w:val="NoSpacing"/>
+        <w:spacing w:line="360" w:lineRule="auto"/>
+      </w:pPr>
+      <w:r>
+        <w:t>Modelul conceptual include 11 entitati fundamentale proiectate pentru a cuprinde complet atat gestiunea juridica si financiara a cabinetului, cat si accesul securizat al clientilor in aplicatie pe baza de roluri:</w:t>
+      </w:r>
+    </w:p>
+    <w:p>
+      <w:pPr>
+        <w:pStyle w:val="NoSpacing"/>
+        <w:spacing w:line="360" w:lineRule="auto"/>
+      </w:pPr>
+    </w:p>
+    <w:p>
+      <w:pPr>
+        <w:pStyle w:val="NoSpacing"/>
+        <w:spacing w:line="360" w:lineRule="auto"/>
+      </w:pPr>
+      <w:r>
+        <w:t xml:space="preserve">UTILIZATOR: personalul cabinetului de avocatura care sunt autorizati sa utilizeze sistemul. </w:t>
+      </w:r>
+    </w:p>
+    <w:p>
+      <w:pPr>
+        <w:pStyle w:val="NoSpacing"/>
+        <w:spacing w:line="360" w:lineRule="auto"/>
+      </w:pPr>
+      <w:r>
+        <w:t>Atribute:</w:t>
+      </w:r>
+    </w:p>
+    <w:p>
+      <w:pPr>
+        <w:pStyle w:val="NoSpacing"/>
+        <w:spacing w:line="360" w:lineRule="auto"/>
+      </w:pPr>
+      <w:r>
+        <w:tab/>
+        <w:t>-id_utlizator: identificatorul unic al utilizatorului, PK;</w:t>
+      </w:r>
+    </w:p>
+    <w:p>
+      <w:pPr>
+        <w:pStyle w:val="NoSpacing"/>
+        <w:spacing w:line="360" w:lineRule="auto"/>
+      </w:pPr>
+      <w:r>
+        <w:tab/>
+        <w:t>-nume,prenume: datele de identificare ale utilizatorului;</w:t>
+      </w:r>
+    </w:p>
+    <w:p>
+      <w:pPr>
+        <w:pStyle w:val="NoSpacing"/>
+        <w:spacing w:line="360" w:lineRule="auto"/>
+      </w:pPr>
+      <w:r>
+        <w:tab/>
+        <w:t>-email: adresa de email prin care utilizatorul poate fi contact dar si autentificator de logare;</w:t>
+      </w:r>
+    </w:p>
+    <w:p>
+      <w:pPr>
+        <w:pStyle w:val="NoSpacing"/>
+        <w:spacing w:line="360" w:lineRule="auto"/>
+      </w:pPr>
+      <w:r>
+        <w:tab/>
+        <w:t>-telefon: numar de contact;</w:t>
+      </w:r>
+    </w:p>
+    <w:p>
+      <w:pPr>
+        <w:pStyle w:val="NoSpacing"/>
+        <w:spacing w:line="360" w:lineRule="auto"/>
+        <w:ind w:firstLine="720"/>
+      </w:pPr>
+      <w:r>
+        <w:t>-rol: rolul detinut in aplicatie (titular, colaborator, secretar, client);</w:t>
+      </w:r>
+    </w:p>
+    <w:p>
+      <w:pPr>
+        <w:pStyle w:val="NoSpacing"/>
+        <w:spacing w:line="360" w:lineRule="auto"/>
+      </w:pPr>
+      <w:r>
+        <w:tab/>
+        <w:t>-parola_hash: parola salvata a contului dupa trecerea printr-un hash;</w:t>
+      </w:r>
+    </w:p>
+    <w:p>
+      <w:pPr>
+        <w:pStyle w:val="NoSpacing"/>
+        <w:spacing w:line="360" w:lineRule="auto"/>
+      </w:pPr>
+      <w:r>
+        <w:tab/>
+        <w:t>-activ: indicator daca contul este activ sau nu;</w:t>
+      </w:r>
+    </w:p>
+    <w:p>
+      <w:pPr>
+        <w:pStyle w:val="NoSpacing"/>
+        <w:spacing w:line="360" w:lineRule="auto"/>
+      </w:pPr>
+    </w:p>
+    <w:p>
+      <w:pPr>
+        <w:pStyle w:val="NoSpacing"/>
+        <w:spacing w:line="360" w:lineRule="auto"/>
+      </w:pPr>
+      <w:r>
+        <w:t>CLIENT: reprezinta persoanele reprezentate de cabinet.</w:t>
+      </w:r>
+    </w:p>
+    <w:p>
+      <w:pPr>
+        <w:pStyle w:val="NoSpacing"/>
+        <w:spacing w:line="360" w:lineRule="auto"/>
+      </w:pPr>
+      <w:r>
+        <w:t>Atribute:</w:t>
+      </w:r>
+    </w:p>
+    <w:p>
+      <w:pPr>
+        <w:pStyle w:val="NoSpacing"/>
+        <w:spacing w:line="360" w:lineRule="auto"/>
+        <w:ind w:left="720"/>
+      </w:pPr>
+      <w:r>
+        <w:t>-id_client: identificatorul unic al clientului, PK;</w:t>
+      </w:r>
+      <w:r>
+        <w:br/>
+        <w:t>-id_utilizator: legatura catre contul de utilizator pentru autentificare in aplicatie, FK</w:t>
+      </w:r>
+      <w:r>
+        <w:t>;</w:t>
+      </w:r>
+    </w:p>
+    <w:p>
+      <w:pPr>
+        <w:pStyle w:val="NoSpacing"/>
+        <w:spacing w:line="360" w:lineRule="auto"/>
+        <w:ind w:firstLine="720"/>
+      </w:pPr>
+      <w:r>
+        <w:t>-tip_client: tipul clientului, persoana fizica sau persoana juridica;</w:t>
+      </w:r>
+    </w:p>
+    <w:p>
+      <w:pPr>
+        <w:pStyle w:val="NoSpacing"/>
+        <w:spacing w:line="360" w:lineRule="auto"/>
+        <w:ind w:firstLine="720"/>
+      </w:pPr>
+      <w:r>
+        <w:t>-nume_denumire: numele complet sau denumirea oficiala a clientului;</w:t>
+      </w:r>
+    </w:p>
+    <w:p>
+      <w:pPr>
+        <w:pStyle w:val="NoSpacing"/>
+        <w:spacing w:line="360" w:lineRule="auto"/>
+        <w:ind w:firstLine="720"/>
+      </w:pPr>
+      <w:r>
+        <w:t xml:space="preserve">-cnp_cui: codul numeric personal sau codul unic de identificare fiscala; </w:t>
+      </w:r>
+    </w:p>
+    <w:p>
+      <w:pPr>
+        <w:pStyle w:val="NoSpacing"/>
+        <w:spacing w:line="360" w:lineRule="auto"/>
+        <w:ind w:firstLine="720"/>
+      </w:pPr>
+      <w:r>
+        <w:t xml:space="preserve">-adresa: domiciliul </w:t>
+      </w:r>
+      <w:r>
+        <w:t>clientului</w:t>
+      </w:r>
+      <w:r>
+        <w:t xml:space="preserve">; </w:t>
+      </w:r>
+    </w:p>
+    <w:p>
+      <w:pPr>
+        <w:pStyle w:val="NoSpacing"/>
+        <w:spacing w:line="360" w:lineRule="auto"/>
+        <w:ind w:firstLine="720"/>
+      </w:pPr>
+      <w:r>
+        <w:t>-data_inregistrare: data la care clientul a fost inregistrat in sistem;</w:t>
+      </w:r>
+    </w:p>
+    <w:p>
+      <w:pPr>
+        <w:pStyle w:val="NoSpacing"/>
+        <w:spacing w:line="360" w:lineRule="auto"/>
+        <w:ind w:firstLine="720"/>
+      </w:pPr>
+    </w:p>
+    <w:p>
+      <w:pPr>
+        <w:pStyle w:val="NoSpacing"/>
+        <w:spacing w:line="360" w:lineRule="auto"/>
+      </w:pPr>
+      <w:r>
+        <w:t>CONTACT_CLIENT: salveaza modalitatile de comunicare pentru fiecare client in parte.</w:t>
+      </w:r>
+    </w:p>
+    <w:p>
+      <w:pPr>
+        <w:pStyle w:val="NoSpacing"/>
+        <w:spacing w:line="360" w:lineRule="auto"/>
+      </w:pPr>
+      <w:r>
+        <w:t xml:space="preserve">Atribute: </w:t>
+      </w:r>
+    </w:p>
+    <w:p>
+      <w:pPr>
+        <w:pStyle w:val="NoSpacing"/>
+        <w:spacing w:line="360" w:lineRule="auto"/>
+        <w:ind w:firstLine="720"/>
+      </w:pPr>
+      <w:r>
+        <w:t xml:space="preserve">-id_contact: identificatorul unic al intrarii de contact, PK; </w:t>
+      </w:r>
+    </w:p>
+    <w:p>
+      <w:pPr>
+        <w:pStyle w:val="NoSpacing"/>
+        <w:spacing w:line="360" w:lineRule="auto"/>
+        <w:ind w:firstLine="720"/>
+      </w:pPr>
+      <w:r>
+        <w:t xml:space="preserve">-id_client: identificatorul clientului caruia ii apartine contactul, FK; </w:t>
+      </w:r>
+    </w:p>
+    <w:p>
+      <w:pPr>
+        <w:pStyle w:val="NoSpacing"/>
+        <w:spacing w:line="360" w:lineRule="auto"/>
+        <w:ind w:firstLine="720"/>
       </w:pPr>
       <w:r>
         <w:lastRenderedPageBreak/>
-        <w:t>UTILIZATOR: personalul cabinetului de avocatura care sunt autorizati sa utilizeze sistemul. Nu include clienti.</w:t>
-      </w:r>
-    </w:p>
-    <w:p>
-      <w:pPr>
-        <w:pStyle w:val="NoSpacing"/>
+        <w:t xml:space="preserve">-tip_contact:tipul de contact, adica telefon sau mail; </w:t>
+      </w:r>
+    </w:p>
+    <w:p>
+      <w:pPr>
+        <w:pStyle w:val="NoSpacing"/>
+        <w:spacing w:line="360" w:lineRule="auto"/>
+        <w:ind w:firstLine="720"/>
+      </w:pPr>
+      <w:r>
+        <w:t>-valoare: contactul propriu zis al clientului;</w:t>
+      </w:r>
+    </w:p>
+    <w:p>
+      <w:pPr>
+        <w:pStyle w:val="NoSpacing"/>
+        <w:spacing w:line="360" w:lineRule="auto"/>
+        <w:ind w:firstLine="720"/>
+      </w:pPr>
+      <w:r>
+        <w:t>-principal: indicator daca este modalitatea principala de contact sau nu;</w:t>
+      </w:r>
+    </w:p>
+    <w:p>
+      <w:pPr>
+        <w:pStyle w:val="NoSpacing"/>
+        <w:spacing w:line="360" w:lineRule="auto"/>
+      </w:pPr>
+    </w:p>
+    <w:p>
+      <w:pPr>
+        <w:pStyle w:val="NoSpacing"/>
+        <w:spacing w:line="360" w:lineRule="auto"/>
+      </w:pPr>
+      <w:r>
+        <w:t xml:space="preserve">INSTANTA:locul unde se desfasoara dosarele cabinetului. </w:t>
+      </w:r>
+    </w:p>
+    <w:p>
+      <w:pPr>
+        <w:pStyle w:val="NoSpacing"/>
+        <w:spacing w:line="360" w:lineRule="auto"/>
+      </w:pPr>
+      <w:r>
+        <w:t xml:space="preserve">Atribute: </w:t>
+      </w:r>
+    </w:p>
+    <w:p>
+      <w:pPr>
+        <w:pStyle w:val="NoSpacing"/>
+        <w:spacing w:line="360" w:lineRule="auto"/>
+        <w:ind w:firstLine="720"/>
+      </w:pPr>
+      <w:r>
+        <w:t xml:space="preserve">-id_instanta: identificatorul unic al instantei, PK; </w:t>
+      </w:r>
+    </w:p>
+    <w:p>
+      <w:pPr>
+        <w:pStyle w:val="NoSpacing"/>
+        <w:spacing w:line="360" w:lineRule="auto"/>
+        <w:ind w:firstLine="720"/>
+      </w:pPr>
+      <w:r>
+        <w:t xml:space="preserve">-denumire: denumirea oficiala a instantei de judecata; </w:t>
+      </w:r>
+    </w:p>
+    <w:p>
+      <w:pPr>
+        <w:pStyle w:val="NoSpacing"/>
+        <w:spacing w:line="360" w:lineRule="auto"/>
+        <w:ind w:firstLine="720"/>
+      </w:pPr>
+      <w:r>
+        <w:t xml:space="preserve">-tip_instanta: poate fi tribunal, judecatorie sau curte de apel; </w:t>
+      </w:r>
+    </w:p>
+    <w:p>
+      <w:pPr>
+        <w:pStyle w:val="NoSpacing"/>
+        <w:spacing w:line="360" w:lineRule="auto"/>
+        <w:ind w:firstLine="720"/>
+      </w:pPr>
+      <w:r>
+        <w:t>-localitate: orasul in care se afla instanta;</w:t>
+      </w:r>
+    </w:p>
+    <w:p>
+      <w:pPr>
+        <w:pStyle w:val="NoSpacing"/>
+        <w:spacing w:line="360" w:lineRule="auto"/>
+        <w:ind w:firstLine="720"/>
+      </w:pPr>
+      <w:r>
+        <w:t>-adresa: adresa fizica a instantei;</w:t>
+      </w:r>
+    </w:p>
+    <w:p>
+      <w:pPr>
+        <w:pStyle w:val="NoSpacing"/>
+        <w:spacing w:after="80" w:line="360" w:lineRule="auto"/>
+      </w:pPr>
+    </w:p>
+    <w:p>
+      <w:pPr>
+        <w:pStyle w:val="NoSpacing"/>
+        <w:spacing w:after="40" w:line="360" w:lineRule="auto"/>
+      </w:pPr>
+      <w:r>
+        <w:t>DOSAR: entitatea centrala a sistemului, reprezentand cauza juridica instrumentata de cabinet.</w:t>
+      </w:r>
+    </w:p>
+    <w:p>
+      <w:pPr>
+        <w:pStyle w:val="NoSpacing"/>
+        <w:spacing w:after="40" w:line="360" w:lineRule="auto"/>
       </w:pPr>
       <w:r>
         <w:t>Atribute:</w:t>
@@ -2241,82 +3295,118 @@
     <w:p>
       <w:pPr>
         <w:pStyle w:val="NoSpacing"/>
-      </w:pPr>
-      <w:r>
-        <w:tab/>
-        <w:t>-id_utlizator: identificatorul unic al utilizatorului, PK;</w:t>
-      </w:r>
-    </w:p>
-    <w:p>
-      <w:pPr>
-        <w:pStyle w:val="NoSpacing"/>
-      </w:pPr>
-      <w:r>
-        <w:tab/>
-        <w:t>-nume,prenume: datele de identificare ale utilizatorului;</w:t>
-      </w:r>
-    </w:p>
-    <w:p>
-      <w:pPr>
-        <w:pStyle w:val="NoSpacing"/>
-      </w:pPr>
-      <w:r>
-        <w:tab/>
-        <w:t>-email: adresa de email prin care utilizatorul poate fi contact dar si autentificator de logare;</w:t>
-      </w:r>
-    </w:p>
-    <w:p>
-      <w:pPr>
-        <w:pStyle w:val="NoSpacing"/>
-      </w:pPr>
-      <w:r>
-        <w:tab/>
-        <w:t>-telefon: numar de contact;</w:t>
-      </w:r>
-    </w:p>
-    <w:p>
-      <w:pPr>
-        <w:pStyle w:val="NoSpacing"/>
-      </w:pPr>
-      <w:r>
-        <w:tab/>
-        <w:t>-rol: rolul in cadrul platformei. Poate fi titular,colaborator sau secretar;</w:t>
-      </w:r>
-    </w:p>
-    <w:p>
-      <w:pPr>
-        <w:pStyle w:val="NoSpacing"/>
-      </w:pPr>
-      <w:r>
-        <w:tab/>
-        <w:t>-parola_hash: parola salvata a contului dupa trecerea printr-un hash;</w:t>
-      </w:r>
-    </w:p>
-    <w:p>
-      <w:pPr>
-        <w:pStyle w:val="NoSpacing"/>
-      </w:pPr>
-      <w:r>
-        <w:tab/>
-        <w:t>-activ: indicator daca contul este activ sau nu;</w:t>
-      </w:r>
-    </w:p>
-    <w:p>
-      <w:pPr>
-        <w:pStyle w:val="NoSpacing"/>
-      </w:pPr>
-    </w:p>
-    <w:p>
-      <w:pPr>
-        <w:pStyle w:val="NoSpacing"/>
-      </w:pPr>
-      <w:r>
-        <w:t>CLIENT: reprezinta persoanele reprezentate de cabinet.</w:t>
-      </w:r>
-    </w:p>
-    <w:p>
-      <w:pPr>
-        <w:pStyle w:val="NoSpacing"/>
+        <w:spacing w:after="40" w:line="360" w:lineRule="auto"/>
+        <w:ind w:firstLine="720"/>
+      </w:pPr>
+      <w:r>
+        <w:t>-id_dosar: identificatorul unic al dosarului, PK;</w:t>
+      </w:r>
+    </w:p>
+    <w:p>
+      <w:pPr>
+        <w:pStyle w:val="NoSpacing"/>
+        <w:spacing w:after="40" w:line="360" w:lineRule="auto"/>
+        <w:ind w:firstLine="720"/>
+      </w:pPr>
+      <w:r>
+        <w:t>-id_client: referinta catre clientul reprezentat, FK;</w:t>
+      </w:r>
+    </w:p>
+    <w:p>
+      <w:pPr>
+        <w:pStyle w:val="NoSpacing"/>
+        <w:spacing w:after="40" w:line="360" w:lineRule="auto"/>
+        <w:ind w:firstLine="720"/>
+      </w:pPr>
+      <w:r>
+        <w:t>-id_instanta: instanta de judecata competenta la care se afla dosarul, FK;</w:t>
+      </w:r>
+    </w:p>
+    <w:p>
+      <w:pPr>
+        <w:pStyle w:val="NoSpacing"/>
+        <w:spacing w:after="40" w:line="360" w:lineRule="auto"/>
+        <w:ind w:firstLine="720"/>
+      </w:pPr>
+      <w:r>
+        <w:t>-numar_dosar: numarul unic oficial atribuit de instanta de judecata;</w:t>
+      </w:r>
+    </w:p>
+    <w:p>
+      <w:pPr>
+        <w:pStyle w:val="NoSpacing"/>
+        <w:spacing w:after="40" w:line="360" w:lineRule="auto"/>
+        <w:ind w:firstLine="720"/>
+      </w:pPr>
+      <w:r>
+        <w:t>-obiect_cauza: obiectul litigiului sau materia juridica tratata;</w:t>
+      </w:r>
+    </w:p>
+    <w:p>
+      <w:pPr>
+        <w:pStyle w:val="NoSpacing"/>
+        <w:spacing w:after="40" w:line="360" w:lineRule="auto"/>
+        <w:ind w:firstLine="720"/>
+      </w:pPr>
+      <w:r>
+        <w:t>-faza_procedurala: faza procesuala curenta (fond, apel, recurs etc.);</w:t>
+      </w:r>
+    </w:p>
+    <w:p>
+      <w:pPr>
+        <w:pStyle w:val="NoSpacing"/>
+        <w:spacing w:after="40" w:line="360" w:lineRule="auto"/>
+        <w:ind w:firstLine="720"/>
+      </w:pPr>
+      <w:r>
+        <w:t>-stare: stadiul administrativ (activ, suspendat, solutionat, arhivat);</w:t>
+      </w:r>
+    </w:p>
+    <w:p>
+      <w:pPr>
+        <w:pStyle w:val="NoSpacing"/>
+        <w:spacing w:after="40" w:line="360" w:lineRule="auto"/>
+        <w:ind w:firstLine="720"/>
+      </w:pPr>
+      <w:r>
+        <w:t>-data_deschidere: data inregistrarii dosarului in cabinet;</w:t>
+      </w:r>
+    </w:p>
+    <w:p>
+      <w:pPr>
+        <w:pStyle w:val="NoSpacing"/>
+        <w:spacing w:after="40" w:line="360" w:lineRule="auto"/>
+        <w:ind w:firstLine="720"/>
+      </w:pPr>
+      <w:r>
+        <w:t>-data_inchidere: data finalizarii sau arhivarii cauzei.</w:t>
+      </w:r>
+    </w:p>
+    <w:p>
+      <w:pPr>
+        <w:pStyle w:val="NoSpacing"/>
+        <w:spacing w:after="80" w:line="360" w:lineRule="auto"/>
+      </w:pPr>
+    </w:p>
+    <w:p>
+      <w:pPr>
+        <w:pStyle w:val="NoSpacing"/>
+        <w:spacing w:after="40" w:line="360" w:lineRule="auto"/>
+      </w:pPr>
+      <w:r>
+        <w:t xml:space="preserve">AVOCAT: avocatul din cadrul cabinetului care gestioneaza si </w:t>
+      </w:r>
+      <w:r>
+        <w:t>actioneaza</w:t>
+      </w:r>
+      <w:r>
+        <w:t xml:space="preserve"> in cauzele repartizate.</w:t>
+      </w:r>
+    </w:p>
+    <w:p>
+      <w:pPr>
+        <w:pStyle w:val="NoSpacing"/>
+        <w:spacing w:after="40" w:line="360" w:lineRule="auto"/>
       </w:pPr>
       <w:r>
         <w:t>Atribute:</w:t>
@@ -2325,243 +3415,459 @@
     <w:p>
       <w:pPr>
         <w:pStyle w:val="NoSpacing"/>
-      </w:pPr>
-      <w:r>
-        <w:tab/>
-      </w:r>
-      <w:r>
-        <w:t>-id_client: identificatorul unic al clientului, PK;</w:t>
-      </w:r>
-    </w:p>
-    <w:p>
-      <w:pPr>
-        <w:pStyle w:val="NoSpacing"/>
-        <w:ind w:firstLine="720"/>
-      </w:pPr>
-      <w:r>
-        <w:t>-tip_client: tipul clientului, persoana fizica sau persoana juridica;</w:t>
-      </w:r>
-    </w:p>
-    <w:p>
-      <w:pPr>
-        <w:pStyle w:val="NoSpacing"/>
-        <w:ind w:firstLine="720"/>
-      </w:pPr>
-      <w:r>
-        <w:t>-nume_denumire: numele complet sau denumirea oficiala a clientului;</w:t>
-      </w:r>
-    </w:p>
-    <w:p>
-      <w:pPr>
-        <w:pStyle w:val="NoSpacing"/>
-        <w:ind w:firstLine="720"/>
-      </w:pPr>
-      <w:r>
-        <w:t xml:space="preserve">-cnp_cui: codul numeric personal sau codul unic de identificare fiscala; </w:t>
-      </w:r>
-    </w:p>
-    <w:p>
-      <w:pPr>
-        <w:pStyle w:val="NoSpacing"/>
-        <w:ind w:firstLine="720"/>
-      </w:pPr>
-      <w:r>
-        <w:t xml:space="preserve">-adresa: domiciliul </w:t>
-      </w:r>
-      <w:r>
-        <w:t>clientului</w:t>
-      </w:r>
-      <w:r>
-        <w:t xml:space="preserve">; </w:t>
-      </w:r>
-    </w:p>
-    <w:p>
-      <w:pPr>
-        <w:pStyle w:val="NoSpacing"/>
-        <w:ind w:firstLine="720"/>
-      </w:pPr>
-      <w:r>
-        <w:t>-data_inregistrare: data la care clientul a fost inregistrat in sistem;</w:t>
-      </w:r>
-    </w:p>
-    <w:p>
-      <w:pPr>
-        <w:pStyle w:val="NoSpacing"/>
-      </w:pPr>
-      <w:r>
-        <w:t xml:space="preserve">CONTACT_CLIENT: </w:t>
-      </w:r>
-      <w:r>
-        <w:t>salveaza modalitatile de comunicare pentru fiecare client in parte.</w:t>
-      </w:r>
-    </w:p>
-    <w:p>
-      <w:pPr>
-        <w:pStyle w:val="NoSpacing"/>
-      </w:pPr>
-      <w:r>
-        <w:t xml:space="preserve">Atribute: </w:t>
-      </w:r>
-    </w:p>
-    <w:p>
-      <w:pPr>
-        <w:pStyle w:val="NoSpacing"/>
-        <w:ind w:firstLine="720"/>
-      </w:pPr>
-      <w:r>
-        <w:t xml:space="preserve">-id_contact: identificatorul unic al intrarii de contact, PK; </w:t>
-      </w:r>
-    </w:p>
-    <w:p>
-      <w:pPr>
-        <w:pStyle w:val="NoSpacing"/>
-        <w:ind w:firstLine="720"/>
-      </w:pPr>
-      <w:r>
-        <w:t xml:space="preserve">-id_client: identificatorul clientului caruia ii apartine contactul, FK; </w:t>
-      </w:r>
-    </w:p>
-    <w:p>
-      <w:pPr>
-        <w:pStyle w:val="NoSpacing"/>
-        <w:ind w:firstLine="720"/>
-      </w:pPr>
-      <w:r>
-        <w:t>-tip_contact:</w:t>
-      </w:r>
-      <w:r>
-        <w:t>tipul de contact, adica telefon sau mail</w:t>
-      </w:r>
-      <w:r>
-        <w:t xml:space="preserve">; </w:t>
-      </w:r>
-    </w:p>
-    <w:p>
-      <w:pPr>
-        <w:pStyle w:val="NoSpacing"/>
-        <w:ind w:firstLine="720"/>
-      </w:pPr>
-      <w:r>
-        <w:t xml:space="preserve">-valoare: </w:t>
-      </w:r>
-      <w:r>
-        <w:t>contactul propriu zis al clientului;</w:t>
-      </w:r>
-    </w:p>
-    <w:p>
-      <w:pPr>
-        <w:pStyle w:val="NoSpacing"/>
-        <w:ind w:firstLine="720"/>
-      </w:pPr>
-      <w:r>
-        <w:t>-principal: indicator daca este modalitatea principala de contact</w:t>
-      </w:r>
-      <w:r>
-        <w:t xml:space="preserve"> sau nu</w:t>
-      </w:r>
-      <w:r>
-        <w:t>;</w:t>
-      </w:r>
-    </w:p>
-    <w:p>
-      <w:pPr>
-        <w:pStyle w:val="NoSpacing"/>
-      </w:pPr>
-    </w:p>
-    <w:p>
-      <w:pPr>
-        <w:pStyle w:val="NoSpacing"/>
-      </w:pPr>
-      <w:r>
-        <w:t>INSTANTA:</w:t>
-      </w:r>
-      <w:r>
-        <w:t xml:space="preserve">locul </w:t>
-      </w:r>
-      <w:r>
-        <w:t xml:space="preserve">unde se desfasoara dosarele cabinetului. </w:t>
-      </w:r>
-    </w:p>
-    <w:p>
-      <w:pPr>
-        <w:pStyle w:val="NoSpacing"/>
-      </w:pPr>
-      <w:r>
-        <w:t xml:space="preserve">Atribute: </w:t>
-      </w:r>
-    </w:p>
-    <w:p>
-      <w:pPr>
-        <w:pStyle w:val="NoSpacing"/>
-        <w:ind w:firstLine="720"/>
-      </w:pPr>
-      <w:r>
-        <w:t xml:space="preserve">-id_instanta: identificatorul unic al instantei, PK; </w:t>
-      </w:r>
-    </w:p>
-    <w:p>
-      <w:pPr>
-        <w:pStyle w:val="NoSpacing"/>
-        <w:ind w:firstLine="720"/>
-      </w:pPr>
-      <w:r>
-        <w:t xml:space="preserve">-denumire: denumirea oficiala a instantei de judecata; </w:t>
-      </w:r>
-    </w:p>
-    <w:p>
-      <w:pPr>
-        <w:pStyle w:val="NoSpacing"/>
-        <w:ind w:firstLine="720"/>
-      </w:pPr>
-      <w:r>
-        <w:t xml:space="preserve">-tip_instanta: </w:t>
-      </w:r>
-      <w:r>
-        <w:t>poate fi tribunal, judecatorie sau curte de apel;</w:t>
-      </w:r>
-      <w:r>
-        <w:t xml:space="preserve"> </w:t>
-      </w:r>
-    </w:p>
-    <w:p>
-      <w:pPr>
-        <w:pStyle w:val="NoSpacing"/>
-        <w:ind w:firstLine="720"/>
-      </w:pPr>
-      <w:r>
-        <w:t>-localitate: orasul in care se afla instant</w:t>
-      </w:r>
-      <w:r>
-        <w:t>a</w:t>
-      </w:r>
-      <w:r>
-        <w:t>;</w:t>
-      </w:r>
-    </w:p>
-    <w:p>
-      <w:pPr>
-        <w:pStyle w:val="NoSpacing"/>
-        <w:ind w:firstLine="720"/>
-      </w:pPr>
-      <w:r>
-        <w:t>-adresa: adresa fizica a instantei;</w:t>
-      </w:r>
-    </w:p>
-    <w:p>
-      <w:pPr>
-        <w:pStyle w:val="NoSpacing"/>
-        <w:ind w:firstLine="720"/>
-      </w:pPr>
-    </w:p>
-    <w:p>
-      <w:pPr>
-        <w:pStyle w:val="NoSpacing"/>
-        <w:ind w:firstLine="720"/>
+        <w:spacing w:after="40" w:line="360" w:lineRule="auto"/>
+        <w:ind w:firstLine="720"/>
+      </w:pPr>
+      <w:r>
+        <w:t>-id_avocat: identificatorul unic al avocatului, PK;</w:t>
+      </w:r>
+    </w:p>
+    <w:p>
+      <w:pPr>
+        <w:pStyle w:val="NoSpacing"/>
+        <w:spacing w:after="40" w:line="360" w:lineRule="auto"/>
+        <w:ind w:firstLine="720"/>
+      </w:pPr>
+      <w:r>
+        <w:t>-id_utilizator: referinta catre contul de utilizator asociat, FK, UNIQUE;</w:t>
+      </w:r>
+    </w:p>
+    <w:p>
+      <w:pPr>
+        <w:pStyle w:val="NoSpacing"/>
+        <w:spacing w:after="40" w:line="360" w:lineRule="auto"/>
+        <w:ind w:firstLine="720"/>
+      </w:pPr>
+      <w:r>
+        <w:t>-specializare: domeniul juridic principal de expertiza (ex: drept civil, penal, comercial);</w:t>
+      </w:r>
+    </w:p>
+    <w:p>
+      <w:pPr>
+        <w:pStyle w:val="NoSpacing"/>
+        <w:spacing w:after="40" w:line="360" w:lineRule="auto"/>
+        <w:ind w:firstLine="720"/>
+      </w:pPr>
+      <w:r>
+        <w:t>-data_angajare: data inceperii activitatii in cadrul cabinetului.</w:t>
+      </w:r>
+    </w:p>
+    <w:p>
+      <w:pPr>
+        <w:pStyle w:val="NoSpacing"/>
+        <w:spacing w:after="80" w:line="360" w:lineRule="auto"/>
+      </w:pPr>
+    </w:p>
+    <w:p>
+      <w:pPr>
+        <w:pStyle w:val="NoSpacing"/>
+        <w:spacing w:after="40" w:line="360" w:lineRule="auto"/>
+      </w:pPr>
+      <w:r>
+        <w:t>TERMEN: termenele de judecata sau termenele procedurale stabilite pentru dosar.</w:t>
+      </w:r>
+    </w:p>
+    <w:p>
+      <w:pPr>
+        <w:pStyle w:val="NoSpacing"/>
+        <w:spacing w:after="40" w:line="360" w:lineRule="auto"/>
+      </w:pPr>
+      <w:r>
+        <w:t>Atribute:</w:t>
+      </w:r>
+    </w:p>
+    <w:p>
+      <w:pPr>
+        <w:pStyle w:val="NoSpacing"/>
+        <w:spacing w:after="40" w:line="360" w:lineRule="auto"/>
+        <w:ind w:firstLine="720"/>
+      </w:pPr>
+      <w:r>
+        <w:t>-id_termen: identificatorul unic al termenului, PK;</w:t>
+      </w:r>
+    </w:p>
+    <w:p>
+      <w:pPr>
+        <w:pStyle w:val="NoSpacing"/>
+        <w:spacing w:after="40" w:line="360" w:lineRule="auto"/>
+        <w:ind w:firstLine="720"/>
+      </w:pPr>
+      <w:r>
+        <w:t>-id_dosar: identificatorul dosarului caruia ii este asociat termenul, FK;</w:t>
+      </w:r>
+    </w:p>
+    <w:p>
+      <w:pPr>
+        <w:pStyle w:val="NoSpacing"/>
+        <w:spacing w:after="40" w:line="360" w:lineRule="auto"/>
+        <w:ind w:firstLine="720"/>
+      </w:pPr>
+      <w:r>
+        <w:t>-data_termen: data si ora stabilite pentru sedinta;</w:t>
+      </w:r>
+    </w:p>
+    <w:p>
+      <w:pPr>
+        <w:pStyle w:val="NoSpacing"/>
+        <w:spacing w:after="40" w:line="360" w:lineRule="auto"/>
+        <w:ind w:firstLine="720"/>
+      </w:pPr>
+      <w:r>
+        <w:t>-tip_termen: tipul termenului (sedinta de judecata, depunere concluzii scrise, redactare);</w:t>
+      </w:r>
+    </w:p>
+    <w:p>
+      <w:pPr>
+        <w:pStyle w:val="NoSpacing"/>
+        <w:spacing w:after="40" w:line="360" w:lineRule="auto"/>
+        <w:ind w:firstLine="720"/>
+      </w:pPr>
+      <w:r>
+        <w:t>-descriere: dispozitiile instantei si masurile stabilite;</w:t>
+      </w:r>
+    </w:p>
+    <w:p>
+      <w:pPr>
+        <w:pStyle w:val="NoSpacing"/>
+        <w:spacing w:after="40" w:line="360" w:lineRule="auto"/>
+        <w:ind w:firstLine="720"/>
+      </w:pPr>
+      <w:r>
+        <w:t>-stare: stadiul termenului (programat, amanat, finalizat).</w:t>
+      </w:r>
+    </w:p>
+    <w:p>
+      <w:pPr>
+        <w:pStyle w:val="NoSpacing"/>
+        <w:spacing w:after="80" w:line="360" w:lineRule="auto"/>
+      </w:pPr>
+    </w:p>
+    <w:p>
+      <w:pPr>
+        <w:pStyle w:val="NoSpacing"/>
+        <w:spacing w:after="40" w:line="360" w:lineRule="auto"/>
+      </w:pPr>
+      <w:r>
+        <w:t>INTALNIRE: intalnirile de consultanta, pregatire si audierile cu clientii asociate dosarului.</w:t>
+      </w:r>
+    </w:p>
+    <w:p>
+      <w:pPr>
+        <w:pStyle w:val="NoSpacing"/>
+        <w:spacing w:after="40" w:line="360" w:lineRule="auto"/>
+      </w:pPr>
+      <w:r>
+        <w:t>Atribute:</w:t>
+      </w:r>
+    </w:p>
+    <w:p>
+      <w:pPr>
+        <w:pStyle w:val="NoSpacing"/>
+        <w:spacing w:after="40" w:line="360" w:lineRule="auto"/>
+        <w:ind w:firstLine="720"/>
+      </w:pPr>
+      <w:r>
+        <w:t>-id_intalnire: identificatorul unic al intalnirii, PK;</w:t>
+      </w:r>
+    </w:p>
+    <w:p>
+      <w:pPr>
+        <w:pStyle w:val="NoSpacing"/>
+        <w:spacing w:after="40" w:line="360" w:lineRule="auto"/>
+        <w:ind w:firstLine="720"/>
+      </w:pPr>
+      <w:r>
+        <w:t>-id_dosar: dosarul caruia ii este asociata sedinta, FK;</w:t>
+      </w:r>
+    </w:p>
+    <w:p>
+      <w:pPr>
+        <w:pStyle w:val="NoSpacing"/>
+        <w:spacing w:after="40" w:line="360" w:lineRule="auto"/>
+        <w:ind w:firstLine="720"/>
+      </w:pPr>
+      <w:r>
+        <w:t>-data_intalnire: data si ora desfasurarii intalnirii;</w:t>
+      </w:r>
+    </w:p>
+    <w:p>
+      <w:pPr>
+        <w:pStyle w:val="NoSpacing"/>
+        <w:spacing w:after="40" w:line="360" w:lineRule="auto"/>
+        <w:ind w:firstLine="720"/>
+      </w:pPr>
+      <w:r>
+        <w:t>-locatie: locatia fizica sau platforma online utilizata;</w:t>
+      </w:r>
+    </w:p>
+    <w:p>
+      <w:pPr>
+        <w:pStyle w:val="NoSpacing"/>
+        <w:spacing w:after="40" w:line="360" w:lineRule="auto"/>
+        <w:ind w:firstLine="720"/>
+      </w:pPr>
+      <w:r>
+        <w:t>-subiect: sumarul si obiectivele discutiilor.</w:t>
+      </w:r>
+    </w:p>
+    <w:p>
+      <w:pPr>
+        <w:pStyle w:val="NoSpacing"/>
+        <w:spacing w:after="80" w:line="360" w:lineRule="auto"/>
+      </w:pPr>
+    </w:p>
+    <w:p>
+      <w:pPr>
+        <w:pStyle w:val="NoSpacing"/>
+        <w:spacing w:after="40" w:line="360" w:lineRule="auto"/>
+      </w:pPr>
+      <w:r>
+        <w:t>DOCUMENT: inscrisurile, cererile, dovezile si hotararile atasate dosarului.</w:t>
+      </w:r>
+    </w:p>
+    <w:p>
+      <w:pPr>
+        <w:pStyle w:val="NoSpacing"/>
+        <w:spacing w:after="40" w:line="360" w:lineRule="auto"/>
+      </w:pPr>
+      <w:r>
+        <w:t>Atribute:</w:t>
+      </w:r>
+    </w:p>
+    <w:p>
+      <w:pPr>
+        <w:pStyle w:val="NoSpacing"/>
+        <w:spacing w:after="40" w:line="360" w:lineRule="auto"/>
+        <w:ind w:firstLine="720"/>
+      </w:pPr>
+      <w:r>
+        <w:t>-id_document: identificatorul unic al documentului, PK;</w:t>
+      </w:r>
+    </w:p>
+    <w:p>
+      <w:pPr>
+        <w:pStyle w:val="NoSpacing"/>
+        <w:spacing w:after="40" w:line="360" w:lineRule="auto"/>
+        <w:ind w:firstLine="720"/>
+      </w:pPr>
+      <w:r>
+        <w:t>-id_dosar: dosarul caruia ii apartine documentul, FK;</w:t>
+      </w:r>
+    </w:p>
+    <w:p>
+      <w:pPr>
+        <w:pStyle w:val="NoSpacing"/>
+        <w:spacing w:after="40" w:line="360" w:lineRule="auto"/>
+        <w:ind w:firstLine="720"/>
+      </w:pPr>
+      <w:r>
+        <w:t>-denumire: denumirea documentului;</w:t>
+      </w:r>
+    </w:p>
+    <w:p>
+      <w:pPr>
+        <w:pStyle w:val="NoSpacing"/>
+        <w:spacing w:after="40" w:line="360" w:lineRule="auto"/>
+        <w:ind w:firstLine="720"/>
+      </w:pPr>
+      <w:r>
+        <w:t>-tip_document: categoria actului (cerere de chemare in judecata, intampinare, probatoriu, hotarare);</w:t>
+      </w:r>
+    </w:p>
+    <w:p>
+      <w:pPr>
+        <w:pStyle w:val="NoSpacing"/>
+        <w:spacing w:after="40" w:line="360" w:lineRule="auto"/>
+        <w:ind w:firstLine="720"/>
+      </w:pPr>
+      <w:r>
+        <w:t>-cale_fisier: calea relativa de stocare pe server;</w:t>
+      </w:r>
+    </w:p>
+    <w:p>
+      <w:pPr>
+        <w:pStyle w:val="NoSpacing"/>
+        <w:spacing w:after="40" w:line="360" w:lineRule="auto"/>
+        <w:ind w:firstLine="720"/>
+      </w:pPr>
+      <w:r>
+        <w:t>-data_incarcare: data salvarii documentului in sistem.</w:t>
+      </w:r>
+    </w:p>
+    <w:p>
+      <w:pPr>
+        <w:pStyle w:val="NoSpacing"/>
+        <w:spacing w:after="80" w:line="360" w:lineRule="auto"/>
+      </w:pPr>
+    </w:p>
+    <w:p>
+      <w:pPr>
+        <w:pStyle w:val="NoSpacing"/>
+        <w:spacing w:after="40" w:line="360" w:lineRule="auto"/>
+      </w:pPr>
+      <w:r>
+        <w:t>FACTURA: documentul fiscal emis pentru serviciile juridice prestate aferente dosarului.</w:t>
+      </w:r>
+    </w:p>
+    <w:p>
+      <w:pPr>
+        <w:pStyle w:val="NoSpacing"/>
+        <w:spacing w:after="40" w:line="360" w:lineRule="auto"/>
+      </w:pPr>
+      <w:r>
+        <w:t>Atribute:</w:t>
+      </w:r>
+    </w:p>
+    <w:p>
+      <w:pPr>
+        <w:pStyle w:val="NoSpacing"/>
+        <w:spacing w:after="40" w:line="360" w:lineRule="auto"/>
+        <w:ind w:firstLine="720"/>
+      </w:pPr>
+      <w:r>
+        <w:lastRenderedPageBreak/>
+        <w:t>-id_factura: identificatorul unic al facturii, PK;</w:t>
+      </w:r>
+    </w:p>
+    <w:p>
+      <w:pPr>
+        <w:pStyle w:val="NoSpacing"/>
+        <w:spacing w:after="40" w:line="360" w:lineRule="auto"/>
+        <w:ind w:firstLine="720"/>
+      </w:pPr>
+      <w:r>
+        <w:t>-id_dosar: dosarul pentru care a fost emisa factura, FK;</w:t>
+      </w:r>
+    </w:p>
+    <w:p>
+      <w:pPr>
+        <w:pStyle w:val="NoSpacing"/>
+        <w:spacing w:after="40" w:line="360" w:lineRule="auto"/>
+        <w:ind w:firstLine="720"/>
+      </w:pPr>
+      <w:r>
+        <w:t>-numar_factura: seria si numarul fiscal al facturii;</w:t>
+      </w:r>
+    </w:p>
+    <w:p>
+      <w:pPr>
+        <w:pStyle w:val="NoSpacing"/>
+        <w:spacing w:after="40" w:line="360" w:lineRule="auto"/>
+        <w:ind w:firstLine="720"/>
+      </w:pPr>
+      <w:r>
+        <w:t>-data_emitere: data emiterii documentului de plata;</w:t>
+      </w:r>
+    </w:p>
+    <w:p>
+      <w:pPr>
+        <w:pStyle w:val="NoSpacing"/>
+        <w:spacing w:after="40" w:line="360" w:lineRule="auto"/>
+        <w:ind w:firstLine="720"/>
+      </w:pPr>
+      <w:r>
+        <w:t>-suma_totala: valoarea totala a onorariului facturat;</w:t>
+      </w:r>
+    </w:p>
+    <w:p>
+      <w:pPr>
+        <w:pStyle w:val="NoSpacing"/>
+        <w:spacing w:after="40" w:line="360" w:lineRule="auto"/>
+        <w:ind w:firstLine="720"/>
+      </w:pPr>
+      <w:r>
+        <w:t>-stare: statusul incasarii (neachitata, platita partial, achitata integral).</w:t>
+      </w:r>
+    </w:p>
+    <w:p>
+      <w:pPr>
+        <w:pStyle w:val="NoSpacing"/>
+        <w:spacing w:after="80" w:line="360" w:lineRule="auto"/>
+      </w:pPr>
+    </w:p>
+    <w:p>
+      <w:pPr>
+        <w:pStyle w:val="NoSpacing"/>
+        <w:spacing w:after="40" w:line="360" w:lineRule="auto"/>
+      </w:pPr>
+      <w:r>
+        <w:t>PLATA: platile efectuate de clienti pentru facturil</w:t>
+      </w:r>
+      <w:r>
+        <w:t>e</w:t>
+      </w:r>
+      <w:r>
+        <w:t xml:space="preserve"> emise (inclusiv in rate).</w:t>
+      </w:r>
+    </w:p>
+    <w:p>
+      <w:pPr>
+        <w:pStyle w:val="NoSpacing"/>
+        <w:spacing w:after="40" w:line="360" w:lineRule="auto"/>
+      </w:pPr>
+      <w:r>
+        <w:t>Atribute:</w:t>
+      </w:r>
+    </w:p>
+    <w:p>
+      <w:pPr>
+        <w:pStyle w:val="NoSpacing"/>
+        <w:spacing w:after="40" w:line="360" w:lineRule="auto"/>
+        <w:ind w:firstLine="720"/>
+      </w:pPr>
+      <w:r>
+        <w:t>-id_plata: identificatorul unic al platii, PK;</w:t>
+      </w:r>
+    </w:p>
+    <w:p>
+      <w:pPr>
+        <w:pStyle w:val="NoSpacing"/>
+        <w:spacing w:after="40" w:line="360" w:lineRule="auto"/>
+        <w:ind w:firstLine="720"/>
+      </w:pPr>
+      <w:r>
+        <w:t>-id_factura: factura asociata platii, FK;</w:t>
+      </w:r>
+    </w:p>
+    <w:p>
+      <w:pPr>
+        <w:pStyle w:val="NoSpacing"/>
+        <w:spacing w:after="40" w:line="360" w:lineRule="auto"/>
+        <w:ind w:firstLine="720"/>
+      </w:pPr>
+      <w:r>
+        <w:t>-data_plata: data receptionarii sumei;</w:t>
+      </w:r>
+    </w:p>
+    <w:p>
+      <w:pPr>
+        <w:pStyle w:val="NoSpacing"/>
+        <w:spacing w:after="40" w:line="360" w:lineRule="auto"/>
+        <w:ind w:firstLine="720"/>
+      </w:pPr>
+      <w:r>
+        <w:t>-suma_platita: cuantumul sumei achitate;</w:t>
+      </w:r>
+    </w:p>
+    <w:p>
+      <w:pPr>
+        <w:pStyle w:val="NoSpacing"/>
+        <w:spacing w:after="40" w:line="360" w:lineRule="auto"/>
+        <w:ind w:firstLine="720"/>
+      </w:pPr>
+      <w:r>
+        <w:t>-metoda_plata: instrumentul utilizat (ordin de plata, transfer bancar, numerar, card).</w:t>
+      </w:r>
+    </w:p>
+    <w:p>
+      <w:pPr>
+        <w:pStyle w:val="NoSpacing"/>
+        <w:spacing w:after="40" w:line="360" w:lineRule="auto"/>
       </w:pPr>
     </w:p>
     <w:sectPr>
-      <w:footerReference w:type="default" r:id="rId10"/>
-      <w:footerReference w:type="first" r:id="rId11"/>
+      <w:footerReference w:type="default" r:id="rId9"/>
+      <w:footerReference w:type="first" r:id="rId10"/>
       <w:pgSz w:w="11906" w:h="16838"/>
       <w:pgMar w:top="1417" w:right="1417" w:bottom="1417" w:left="1417" w:header="708" w:footer="708" w:gutter="0"/>
       <w:pgNumType w:start="1"/>

</xml_diff>